<commit_message>
docs(phase2): qualify final scope and evidence
</commit_message>
<xml_diff>
--- a/docs/phase_2/AgriContract_02_GiaiPhap_MoHinh_final.docx
+++ b/docs/phase_2/AgriContract_02_GiaiPhap_MoHinh_final.docx
@@ -1,6 +1,6 @@
 
 <file path=word/document.xml><?xml version="1.0" encoding="utf-8"?>
-<w:document xmlns:o="urn:schemas-microsoft-com:office:office" xmlns:r="http://schemas.openxmlformats.org/officeDocument/2006/relationships" xmlns:v="urn:schemas-microsoft-com:vml" xmlns:w="http://schemas.openxmlformats.org/wordprocessingml/2006/main" xmlns:w10="urn:schemas-microsoft-com:office:word" xmlns:wp="http://schemas.openxmlformats.org/drawingml/2006/wordprocessingDrawing" xmlns:pic="http://schemas.openxmlformats.org/drawingml/2006/picture" xmlns:wps="http://schemas.microsoft.com/office/word/2010/wordprocessingShape" xmlns:wpg="http://schemas.microsoft.com/office/word/2010/wordprocessingGroup" xmlns:mc="http://schemas.openxmlformats.org/markup-compatibility/2006" xmlns:wp14="http://schemas.microsoft.com/office/word/2010/wordprocessingDrawing" xmlns:w14="http://schemas.microsoft.com/office/word/2010/wordml" xmlns:w15="http://schemas.microsoft.com/office/word/2012/wordml" mc:Ignorable="w14 wp14 w15">
+<w:document xmlns:o="urn:schemas-microsoft-com:office:office" xmlns:r="http://schemas.openxmlformats.org/officeDocument/2006/relationships" xmlns:v="urn:schemas-microsoft-com:vml" xmlns:w="http://schemas.openxmlformats.org/wordprocessingml/2006/main" xmlns:w10="urn:schemas-microsoft-com:office:word" xmlns:wp="http://schemas.openxmlformats.org/drawingml/2006/wordprocessingDrawing" xmlns:wps="http://schemas.microsoft.com/office/word/2010/wordprocessingShape" xmlns:wpg="http://schemas.microsoft.com/office/word/2010/wordprocessingGroup" xmlns:mc="http://schemas.openxmlformats.org/markup-compatibility/2006" xmlns:wp14="http://schemas.microsoft.com/office/word/2010/wordprocessingDrawing" xmlns:w14="http://schemas.microsoft.com/office/word/2010/wordml" xmlns:w15="http://schemas.microsoft.com/office/word/2012/wordml" mc:Ignorable="w14 wp14 w15">
   <w:body>
     <w:p>
       <w:pPr>
@@ -155,7 +155,7 @@
             </w:rPr>
             <w:fldChar w:fldCharType="separate"/>
           </w:r>
-          <w:hyperlink w:anchor="__RefHeading___Toc492_AgriContract">
+          <w:hyperlink w:anchor="__RefHeading___Toc493_AgriContract">
             <w:r>
               <w:rPr>
                 <w:rStyle w:val="IndexLink"/>
@@ -175,7 +175,7 @@
             </w:tabs>
             <w:rPr/>
           </w:pPr>
-          <w:hyperlink w:anchor="__RefHeading___Toc494_AgriContract">
+          <w:hyperlink w:anchor="__RefHeading___Toc495_AgriContract">
             <w:r>
               <w:rPr>
                 <w:rStyle w:val="IndexLink"/>
@@ -195,7 +195,7 @@
             </w:tabs>
             <w:rPr/>
           </w:pPr>
-          <w:hyperlink w:anchor="__RefHeading___Toc496_AgriContract">
+          <w:hyperlink w:anchor="__RefHeading___Toc497_AgriContract">
             <w:r>
               <w:rPr>
                 <w:rStyle w:val="IndexLink"/>
@@ -215,7 +215,7 @@
             </w:tabs>
             <w:rPr/>
           </w:pPr>
-          <w:hyperlink w:anchor="__RefHeading___Toc498_AgriContract">
+          <w:hyperlink w:anchor="__RefHeading___Toc499_AgriContract">
             <w:r>
               <w:rPr>
                 <w:rStyle w:val="IndexLink"/>
@@ -235,7 +235,7 @@
             </w:tabs>
             <w:rPr/>
           </w:pPr>
-          <w:hyperlink w:anchor="__RefHeading___Toc500_AgriContract">
+          <w:hyperlink w:anchor="__RefHeading___Toc501_AgriContract">
             <w:r>
               <w:rPr>
                 <w:rStyle w:val="IndexLink"/>
@@ -255,7 +255,7 @@
             </w:tabs>
             <w:rPr/>
           </w:pPr>
-          <w:hyperlink w:anchor="__RefHeading___Toc502_AgriContract">
+          <w:hyperlink w:anchor="__RefHeading___Toc503_AgriContract">
             <w:r>
               <w:rPr>
                 <w:rStyle w:val="IndexLink"/>
@@ -275,7 +275,7 @@
             </w:tabs>
             <w:rPr/>
           </w:pPr>
-          <w:hyperlink w:anchor="__RefHeading___Toc504_AgriContract">
+          <w:hyperlink w:anchor="__RefHeading___Toc505_AgriContract">
             <w:r>
               <w:rPr>
                 <w:rStyle w:val="IndexLink"/>
@@ -295,7 +295,7 @@
             </w:tabs>
             <w:rPr/>
           </w:pPr>
-          <w:hyperlink w:anchor="__RefHeading___Toc506_AgriContract">
+          <w:hyperlink w:anchor="__RefHeading___Toc507_AgriContract">
             <w:r>
               <w:rPr>
                 <w:rStyle w:val="IndexLink"/>
@@ -315,7 +315,7 @@
             </w:tabs>
             <w:rPr/>
           </w:pPr>
-          <w:hyperlink w:anchor="__RefHeading___Toc508_AgriContract">
+          <w:hyperlink w:anchor="__RefHeading___Toc509_AgriContract">
             <w:r>
               <w:rPr>
                 <w:rStyle w:val="IndexLink"/>
@@ -335,7 +335,7 @@
             </w:tabs>
             <w:rPr/>
           </w:pPr>
-          <w:hyperlink w:anchor="__RefHeading___Toc510_AgriContract">
+          <w:hyperlink w:anchor="__RefHeading___Toc511_AgriContract">
             <w:r>
               <w:rPr>
                 <w:rStyle w:val="IndexLink"/>
@@ -355,7 +355,7 @@
             </w:tabs>
             <w:rPr/>
           </w:pPr>
-          <w:hyperlink w:anchor="__RefHeading___Toc512_AgriContract">
+          <w:hyperlink w:anchor="__RefHeading___Toc513_AgriContract">
             <w:r>
               <w:rPr>
                 <w:rStyle w:val="IndexLink"/>
@@ -375,7 +375,7 @@
             </w:tabs>
             <w:rPr/>
           </w:pPr>
-          <w:hyperlink w:anchor="__RefHeading___Toc514_AgriContract">
+          <w:hyperlink w:anchor="__RefHeading___Toc515_AgriContract">
             <w:r>
               <w:rPr>
                 <w:rStyle w:val="IndexLink"/>
@@ -395,7 +395,7 @@
             </w:tabs>
             <w:rPr/>
           </w:pPr>
-          <w:hyperlink w:anchor="__RefHeading___Toc516_AgriContract">
+          <w:hyperlink w:anchor="__RefHeading___Toc517_AgriContract">
             <w:r>
               <w:rPr>
                 <w:rStyle w:val="IndexLink"/>
@@ -415,7 +415,7 @@
             </w:tabs>
             <w:rPr/>
           </w:pPr>
-          <w:hyperlink w:anchor="__RefHeading___Toc518_AgriContract">
+          <w:hyperlink w:anchor="__RefHeading___Toc519_AgriContract">
             <w:r>
               <w:rPr>
                 <w:rStyle w:val="IndexLink"/>
@@ -435,7 +435,7 @@
             </w:tabs>
             <w:rPr/>
           </w:pPr>
-          <w:hyperlink w:anchor="__RefHeading___Toc520_AgriContract">
+          <w:hyperlink w:anchor="__RefHeading___Toc521_AgriContract">
             <w:r>
               <w:rPr>
                 <w:rStyle w:val="IndexLink"/>
@@ -455,7 +455,7 @@
             </w:tabs>
             <w:rPr/>
           </w:pPr>
-          <w:hyperlink w:anchor="__RefHeading___Toc522_AgriContract">
+          <w:hyperlink w:anchor="__RefHeading___Toc523_AgriContract">
             <w:r>
               <w:rPr>
                 <w:rStyle w:val="IndexLink"/>
@@ -475,7 +475,7 @@
             </w:tabs>
             <w:rPr/>
           </w:pPr>
-          <w:hyperlink w:anchor="__RefHeading___Toc524_AgriContract">
+          <w:hyperlink w:anchor="__RefHeading___Toc525_AgriContract">
             <w:r>
               <w:rPr>
                 <w:rStyle w:val="IndexLink"/>
@@ -495,7 +495,7 @@
             </w:tabs>
             <w:rPr/>
           </w:pPr>
-          <w:hyperlink w:anchor="__RefHeading___Toc526_AgriContract">
+          <w:hyperlink w:anchor="__RefHeading___Toc527_AgriContract">
             <w:r>
               <w:rPr>
                 <w:rStyle w:val="IndexLink"/>
@@ -515,7 +515,7 @@
             </w:tabs>
             <w:rPr/>
           </w:pPr>
-          <w:hyperlink w:anchor="__RefHeading___Toc528_AgriContract">
+          <w:hyperlink w:anchor="__RefHeading___Toc529_AgriContract">
             <w:r>
               <w:rPr>
                 <w:rStyle w:val="IndexLink"/>
@@ -535,14 +535,14 @@
             </w:tabs>
             <w:rPr/>
           </w:pPr>
-          <w:hyperlink w:anchor="__RefHeading___Toc530_AgriContract">
+          <w:hyperlink w:anchor="__RefHeading___Toc531_AgriContract">
             <w:r>
               <w:rPr>
                 <w:rStyle w:val="IndexLink"/>
               </w:rPr>
               <w:t>10. Chiến lược vào thị trường — anchor buyer pilot</w:t>
               <w:tab/>
-              <w:t>7</w:t>
+              <w:t>8</w:t>
             </w:r>
           </w:hyperlink>
         </w:p>
@@ -555,7 +555,7 @@
             </w:tabs>
             <w:rPr/>
           </w:pPr>
-          <w:hyperlink w:anchor="__RefHeading___Toc532_AgriContract">
+          <w:hyperlink w:anchor="__RefHeading___Toc533_AgriContract">
             <w:r>
               <w:rPr>
                 <w:rStyle w:val="IndexLink"/>
@@ -575,12 +575,12 @@
             </w:tabs>
             <w:rPr/>
           </w:pPr>
-          <w:hyperlink w:anchor="__RefHeading___Toc534_AgriContract">
+          <w:hyperlink w:anchor="__RefHeading___Toc535_AgriContract">
             <w:r>
               <w:rPr>
                 <w:rStyle w:val="IndexLink"/>
               </w:rPr>
-              <w:t>12. Giới hạn và phạm vi ngoài</w:t>
+              <w:t>12. Current Scope</w:t>
               <w:tab/>
               <w:t>8</w:t>
             </w:r>
@@ -595,12 +595,12 @@
             </w:tabs>
             <w:rPr/>
           </w:pPr>
-          <w:hyperlink w:anchor="__RefHeading___Toc536_AgriContract">
+          <w:hyperlink w:anchor="__RefHeading___Toc537_AgriContract">
             <w:r>
               <w:rPr>
                 <w:rStyle w:val="IndexLink"/>
               </w:rPr>
-              <w:t>13. Danh mục nguồn tham khảo</w:t>
+              <w:t>13. Known Limitations</w:t>
               <w:tab/>
               <w:t>8</w:t>
             </w:r>
@@ -608,59 +608,39 @@
         </w:p>
         <w:p>
           <w:pPr>
-            <w:pStyle w:val="TOC3"/>
+            <w:pStyle w:val="TOC1"/>
             <w:tabs>
-              <w:tab w:val="clear" w:pos="9071"/>
+              <w:tab w:val="clear" w:pos="9638"/>
               <w:tab w:val="right" w:pos="9637" w:leader="dot"/>
             </w:tabs>
             <w:rPr/>
           </w:pPr>
-          <w:hyperlink w:anchor="__RefHeading___Toc538_AgriContract">
+          <w:hyperlink w:anchor="__RefHeading___Toc539_AgriContract">
             <w:r>
               <w:rPr>
                 <w:rStyle w:val="IndexLink"/>
               </w:rPr>
-              <w:t>Văn bản pháp luật</w:t>
+              <w:t>14. Future Work</w:t>
               <w:tab/>
-              <w:t>8</w:t>
+              <w:t>9</w:t>
             </w:r>
           </w:hyperlink>
         </w:p>
         <w:p>
           <w:pPr>
-            <w:pStyle w:val="TOC3"/>
+            <w:pStyle w:val="TOC1"/>
             <w:tabs>
-              <w:tab w:val="clear" w:pos="9071"/>
+              <w:tab w:val="clear" w:pos="9638"/>
               <w:tab w:val="right" w:pos="9637" w:leader="dot"/>
             </w:tabs>
             <w:rPr/>
           </w:pPr>
-          <w:hyperlink w:anchor="__RefHeading___Toc540_AgriContract">
+          <w:hyperlink w:anchor="__RefHeading___Toc541_AgriContract">
             <w:r>
               <w:rPr>
                 <w:rStyle w:val="IndexLink"/>
               </w:rPr>
-              <w:t>Án lệ &amp; tổ chức pháp lý</w:t>
-              <w:tab/>
-              <w:t>9</w:t>
-            </w:r>
-          </w:hyperlink>
-        </w:p>
-        <w:p>
-          <w:pPr>
-            <w:pStyle w:val="TOC3"/>
-            <w:tabs>
-              <w:tab w:val="clear" w:pos="9071"/>
-              <w:tab w:val="right" w:pos="9637" w:leader="dot"/>
-            </w:tabs>
-            <w:rPr/>
-          </w:pPr>
-          <w:hyperlink w:anchor="__RefHeading___Toc542_AgriContract">
-            <w:r>
-              <w:rPr>
-                <w:rStyle w:val="IndexLink"/>
-              </w:rPr>
-              <w:t>Thị trường &amp; nghiên cứu</w:t>
+              <w:t>15. Danh mục nguồn tham khảo</w:t>
               <w:tab/>
               <w:t>9</w:t>
             </w:r>
@@ -705,7 +685,7 @@
         <w:spacing w:before="0" w:after="120"/>
         <w:rPr/>
       </w:pPr>
-      <w:bookmarkStart w:id="0" w:name="__RefHeading___Toc492_AgriContract"/>
+      <w:bookmarkStart w:id="0" w:name="__RefHeading___Toc493_AgriContract"/>
       <w:bookmarkEnd w:id="0"/>
       <w:r>
         <w:rPr>
@@ -722,7 +702,7 @@
     <w:p>
       <w:pPr>
         <w:pStyle w:val="Normal"/>
-        <w:spacing w:lineRule="auto" w:line="276" w:before="0" w:after="120"/>
+        <w:spacing w:lineRule="exact" w:line="276" w:before="0" w:after="120"/>
         <w:jc w:val="both"/>
         <w:rPr/>
       </w:pPr>
@@ -743,7 +723,7 @@
     <w:p>
       <w:pPr>
         <w:pStyle w:val="Normal"/>
-        <w:spacing w:lineRule="auto" w:line="276" w:before="0" w:after="120"/>
+        <w:spacing w:lineRule="exact" w:line="276" w:before="0" w:after="120"/>
         <w:jc w:val="both"/>
         <w:rPr/>
       </w:pPr>
@@ -758,7 +738,7 @@
           <w:sz w:val="21"/>
           <w:szCs w:val="21"/>
         </w:rPr>
-        <w:t>Tài liệu này mô tả mô hình người dùng, golden flow, giá trị và giới hạn ở mức nghiệp vụ. API, event wire contract, schema, idempotency và migration chi tiết nằm trong Architecture/SDS. Mọi capability được mô tả là target design; tích hợp ngân hàng/giám định production và legal validation vẫn là giới hạn.</w:t>
+        <w:t>Tài liệu này mô tả mô hình người dùng, golden flow, giá trị, các quy tắc nghiệp vụ và giới hạn ở mức nghiệp vụ. Các quyết định về API, event, schema, idempotency và migration được tóm lược đủ trong phạm vi tài liệu này; mọi capability được mô tả là target design, còn tích hợp ngân hàng/giám định production và legal validation vẫn là giới hạn.</w:t>
       </w:r>
     </w:p>
     <w:p>
@@ -770,7 +750,7 @@
         <w:spacing w:before="320" w:after="120"/>
         <w:rPr/>
       </w:pPr>
-      <w:bookmarkStart w:id="1" w:name="__RefHeading___Toc494_AgriContract"/>
+      <w:bookmarkStart w:id="1" w:name="__RefHeading___Toc495_AgriContract"/>
       <w:bookmarkEnd w:id="1"/>
       <w:r>
         <w:rPr>
@@ -787,7 +767,7 @@
     <w:p>
       <w:pPr>
         <w:pStyle w:val="Normal"/>
-        <w:spacing w:lineRule="auto" w:line="276" w:before="0" w:after="120"/>
+        <w:spacing w:lineRule="exact" w:line="276" w:before="0" w:after="120"/>
         <w:jc w:val="both"/>
         <w:rPr/>
       </w:pPr>
@@ -802,13 +782,13 @@
           <w:sz w:val="21"/>
           <w:szCs w:val="21"/>
         </w:rPr>
-        <w:t>AgriContract là nền tảng số hoá hợp đồng mua bán nông sản B2B với cơ chế tiền cọc và tiền phong toả do ngân hàng giữ. Hợp đồng không bị phủ nhận giá trị pháp lý chỉ vì được giao kết và lưu trữ bằng phương tiện điện tử; hiệu lực vẫn phụ thuộc các điều kiện chung của giao dịch, pháp luật về hợp đồng và quy định có liên quan.</w:t>
+        <w:t>AgriContract là nền tảng số hoá hợp đồng mua bán nông sản B2B với cơ chế tiền cọc và tiền phong toả do custodian/tổ chức tín dụng phù hợp giữ theo mô hình pilot. Hợp đồng không bị phủ nhận giá trị pháp lý chỉ vì được giao kết và lưu trữ bằng phương tiện điện tử; hiệu lực vẫn phụ thuộc các điều kiện chung của giao dịch, pháp luật về hợp đồng và quy định có liên quan. [27]</w:t>
       </w:r>
     </w:p>
     <w:p>
       <w:pPr>
         <w:pStyle w:val="Normal"/>
-        <w:spacing w:lineRule="auto" w:line="276" w:before="0" w:after="120"/>
+        <w:spacing w:lineRule="exact" w:line="276" w:before="0" w:after="120"/>
         <w:jc w:val="both"/>
         <w:rPr/>
       </w:pPr>
@@ -836,7 +816,7 @@
           <w:sz w:val="21"/>
           <w:szCs w:val="21"/>
         </w:rPr>
-        <w:t xml:space="preserve"> AgriContract không xử lý logistics, không phải sàn thương mại điện tử, không thay thế hệ thống kế toán doanh nghiệp. Phần mềm giải quyết một vấn đề cụ thể — thiếu cơ chế thực thi workflow theo điều kiện trong giao dịch forward contract nông sản B2B — và không có tham vọng giải quyết toàn bộ chuỗi cung ứng.</w:t>
+        <w:t xml:space="preserve"> AgriContract không xử lý logistics, không phải sàn thương mại điện tử, không thay thế hệ thống kế toán doanh nghiệp. Phần mềm được thiết kế để xử lý một vấn đề cụ thể — thiếu cơ chế thực thi workflow theo điều kiện trong giao dịch forward contract nông sản B2B — và không có tham vọng giải quyết toàn bộ chuỗi cung ứng.</w:t>
       </w:r>
     </w:p>
     <w:p>
@@ -849,7 +829,7 @@
           <w:right w:val="single" w:sz="2" w:space="6" w:color="D1D5DB"/>
         </w:pBdr>
         <w:shd w:val="clear" w:color="auto" w:fill="F3F4F6"/>
-        <w:spacing w:lineRule="auto" w:line="264" w:before="120" w:after="140"/>
+        <w:spacing w:lineRule="exact" w:line="264" w:before="120" w:after="140"/>
         <w:ind w:start="60" w:end="60"/>
         <w:rPr/>
       </w:pPr>
@@ -862,7 +842,7 @@
           <w:sz w:val="20"/>
           <w:szCs w:val="20"/>
         </w:rPr>
-        <w:t xml:space="preserve">Căn cứ pháp lý — Luật GDĐT 2023, Điều 8, Điều 14 và Điều 34–36. </w:t>
+        <w:t xml:space="preserve">Căn cứ pháp lý — Luật GDĐT 2023, Điều 8, Điều 11 và Điều 34–36. </w:t>
       </w:r>
       <w:r>
         <w:rPr>
@@ -871,7 +851,7 @@
           <w:sz w:val="20"/>
           <w:szCs w:val="20"/>
         </w:rPr>
-        <w:t>Thông tin không bị phủ nhận giá trị pháp lý chỉ vì ở dạng thông điệp dữ liệu; việc giao kết và thực hiện hợp đồng điện tử vẫn phải tuân thủ pháp luật về hợp đồng và quy định liên quan. Audit trail có thể được sử dụng làm chứng cứ, với giá trị phụ thuộc độ tin cậy của phương thức tạo lập, gửi, nhận, lưu trữ và bảo toàn tính toàn vẹn.</w:t>
+        <w:t>Thông tin không bị phủ nhận giá trị pháp lý chỉ vì ở dạng thông điệp dữ liệu; việc giao kết và thực hiện hợp đồng điện tử vẫn phải tuân thủ pháp luật về hợp đồng và quy định liên quan. Audit trail có thể được sử dụng làm chứng cứ, với giá trị phụ thuộc độ tin cậy của phương thức tạo lập, gửi, nhận, lưu trữ và bảo toàn tính toàn vẹn. [27]</w:t>
       </w:r>
     </w:p>
     <w:p>
@@ -883,7 +863,7 @@
         <w:spacing w:before="320" w:after="120"/>
         <w:rPr/>
       </w:pPr>
-      <w:bookmarkStart w:id="2" w:name="__RefHeading___Toc496_AgriContract"/>
+      <w:bookmarkStart w:id="2" w:name="__RefHeading___Toc497_AgriContract"/>
       <w:bookmarkEnd w:id="2"/>
       <w:r>
         <w:rPr>
@@ -900,7 +880,7 @@
     <w:p>
       <w:pPr>
         <w:pStyle w:val="Normal"/>
-        <w:spacing w:lineRule="auto" w:line="276" w:before="0" w:after="120"/>
+        <w:spacing w:lineRule="exact" w:line="276" w:before="0" w:after="120"/>
         <w:jc w:val="both"/>
         <w:rPr/>
       </w:pPr>
@@ -921,7 +901,7 @@
     <w:p>
       <w:pPr>
         <w:pStyle w:val="Normal"/>
-        <w:spacing w:lineRule="auto" w:line="276" w:before="0" w:after="120"/>
+        <w:spacing w:lineRule="exact" w:line="276" w:before="0" w:after="120"/>
         <w:jc w:val="both"/>
         <w:rPr/>
       </w:pPr>
@@ -960,6 +940,7 @@
       <w:tr>
         <w:trPr>
           <w:tblHeader w:val="true"/>
+          <w:cantSplit w:val="true"/>
         </w:trPr>
         <w:tc>
           <w:tcPr>
@@ -976,7 +957,7 @@
           <w:p>
             <w:pPr>
               <w:pStyle w:val="Normal"/>
-              <w:spacing w:lineRule="auto" w:line="252" w:before="0" w:after="0"/>
+              <w:spacing w:lineRule="exact" w:line="252" w:before="0" w:after="0"/>
               <w:jc w:val="start"/>
               <w:rPr/>
             </w:pPr>
@@ -1010,7 +991,7 @@
           <w:p>
             <w:pPr>
               <w:pStyle w:val="Normal"/>
-              <w:spacing w:lineRule="auto" w:line="252" w:before="0" w:after="0"/>
+              <w:spacing w:lineRule="exact" w:line="252" w:before="0" w:after="0"/>
               <w:jc w:val="start"/>
               <w:rPr/>
             </w:pPr>
@@ -1044,7 +1025,7 @@
           <w:p>
             <w:pPr>
               <w:pStyle w:val="Normal"/>
-              <w:spacing w:lineRule="auto" w:line="252" w:before="0" w:after="0"/>
+              <w:spacing w:lineRule="exact" w:line="252" w:before="0" w:after="0"/>
               <w:jc w:val="start"/>
               <w:rPr/>
             </w:pPr>
@@ -1065,7 +1046,9 @@
         </w:tc>
       </w:tr>
       <w:tr>
-        <w:trPr/>
+        <w:trPr>
+          <w:cantSplit w:val="true"/>
+        </w:trPr>
         <w:tc>
           <w:tcPr>
             <w:tcW w:w="2708" w:type="dxa"/>
@@ -1080,7 +1063,7 @@
           <w:p>
             <w:pPr>
               <w:pStyle w:val="Normal"/>
-              <w:spacing w:lineRule="auto" w:line="252" w:before="0" w:after="0"/>
+              <w:spacing w:lineRule="exact" w:line="252" w:before="0" w:after="0"/>
               <w:jc w:val="start"/>
               <w:rPr/>
             </w:pPr>
@@ -1113,7 +1096,7 @@
           <w:p>
             <w:pPr>
               <w:pStyle w:val="Normal"/>
-              <w:spacing w:lineRule="auto" w:line="252" w:before="0" w:after="0"/>
+              <w:spacing w:lineRule="exact" w:line="252" w:before="0" w:after="0"/>
               <w:jc w:val="start"/>
               <w:rPr/>
             </w:pPr>
@@ -1146,7 +1129,7 @@
           <w:p>
             <w:pPr>
               <w:pStyle w:val="Normal"/>
-              <w:spacing w:lineRule="auto" w:line="252" w:before="0" w:after="0"/>
+              <w:spacing w:lineRule="exact" w:line="252" w:before="0" w:after="0"/>
               <w:jc w:val="start"/>
               <w:rPr/>
             </w:pPr>
@@ -1167,7 +1150,9 @@
         </w:tc>
       </w:tr>
       <w:tr>
-        <w:trPr/>
+        <w:trPr>
+          <w:cantSplit w:val="true"/>
+        </w:trPr>
         <w:tc>
           <w:tcPr>
             <w:tcW w:w="2708" w:type="dxa"/>
@@ -1183,7 +1168,7 @@
           <w:p>
             <w:pPr>
               <w:pStyle w:val="Normal"/>
-              <w:spacing w:lineRule="auto" w:line="252" w:before="0" w:after="0"/>
+              <w:spacing w:lineRule="exact" w:line="252" w:before="0" w:after="0"/>
               <w:jc w:val="start"/>
               <w:rPr/>
             </w:pPr>
@@ -1217,7 +1202,7 @@
           <w:p>
             <w:pPr>
               <w:pStyle w:val="Normal"/>
-              <w:spacing w:lineRule="auto" w:line="252" w:before="0" w:after="0"/>
+              <w:spacing w:lineRule="exact" w:line="252" w:before="0" w:after="0"/>
               <w:jc w:val="start"/>
               <w:rPr/>
             </w:pPr>
@@ -1251,7 +1236,7 @@
           <w:p>
             <w:pPr>
               <w:pStyle w:val="Normal"/>
-              <w:spacing w:lineRule="auto" w:line="252" w:before="0" w:after="0"/>
+              <w:spacing w:lineRule="exact" w:line="252" w:before="0" w:after="0"/>
               <w:jc w:val="start"/>
               <w:rPr/>
             </w:pPr>
@@ -1272,7 +1257,9 @@
         </w:tc>
       </w:tr>
       <w:tr>
-        <w:trPr/>
+        <w:trPr>
+          <w:cantSplit w:val="true"/>
+        </w:trPr>
         <w:tc>
           <w:tcPr>
             <w:tcW w:w="2708" w:type="dxa"/>
@@ -1287,7 +1274,7 @@
           <w:p>
             <w:pPr>
               <w:pStyle w:val="Normal"/>
-              <w:spacing w:lineRule="auto" w:line="252" w:before="0" w:after="0"/>
+              <w:spacing w:lineRule="exact" w:line="252" w:before="0" w:after="0"/>
               <w:jc w:val="start"/>
               <w:rPr/>
             </w:pPr>
@@ -1320,7 +1307,7 @@
           <w:p>
             <w:pPr>
               <w:pStyle w:val="Normal"/>
-              <w:spacing w:lineRule="auto" w:line="252" w:before="0" w:after="0"/>
+              <w:spacing w:lineRule="exact" w:line="252" w:before="0" w:after="0"/>
               <w:jc w:val="start"/>
               <w:rPr/>
             </w:pPr>
@@ -1353,7 +1340,7 @@
           <w:p>
             <w:pPr>
               <w:pStyle w:val="Normal"/>
-              <w:spacing w:lineRule="auto" w:line="252" w:before="0" w:after="0"/>
+              <w:spacing w:lineRule="exact" w:line="252" w:before="0" w:after="0"/>
               <w:jc w:val="start"/>
               <w:rPr/>
             </w:pPr>
@@ -1368,13 +1355,15 @@
                 <w:sz w:val="19"/>
                 <w:szCs w:val="19"/>
               </w:rPr>
-              <w:t>Đăng listing sau khi được xác minh; đàm phán và ký hợp đồng điện tử; giao hàng và nhận thanh toán. Nhóm được cơ chế ký quỹ bảo vệ trực tiếp nhất</w:t>
+              <w:t>Đăng listing sau khi được xác minh; đàm phán và ký hợp đồng điện tử; giao hàng và nhận thanh toán. Nhóm được cơ chế ký quỹ thiết kế để bảo vệ trực tiếp nhất</w:t>
             </w:r>
           </w:p>
         </w:tc>
       </w:tr>
       <w:tr>
-        <w:trPr/>
+        <w:trPr>
+          <w:cantSplit w:val="true"/>
+        </w:trPr>
         <w:tc>
           <w:tcPr>
             <w:tcW w:w="2708" w:type="dxa"/>
@@ -1390,7 +1379,7 @@
           <w:p>
             <w:pPr>
               <w:pStyle w:val="Normal"/>
-              <w:spacing w:lineRule="auto" w:line="252" w:before="0" w:after="0"/>
+              <w:spacing w:lineRule="exact" w:line="252" w:before="0" w:after="0"/>
               <w:jc w:val="start"/>
               <w:rPr/>
             </w:pPr>
@@ -1424,7 +1413,7 @@
           <w:p>
             <w:pPr>
               <w:pStyle w:val="Normal"/>
-              <w:spacing w:lineRule="auto" w:line="252" w:before="0" w:after="0"/>
+              <w:spacing w:lineRule="exact" w:line="252" w:before="0" w:after="0"/>
               <w:jc w:val="start"/>
               <w:rPr/>
             </w:pPr>
@@ -1439,7 +1428,7 @@
                 <w:sz w:val="19"/>
                 <w:szCs w:val="19"/>
               </w:rPr>
-              <w:t>Tổ chức giám định được Nhà nước công nhận: Vinacontrol, Quatest, SGS, Bureau Veritas, Intertek</w:t>
+              <w:t>Tổ chức giám định có năng lực và giấy phép/công nhận phù hợp với phạm vi dịch vụ (ví dụ: Vinacontrol, Quatest, SGS, Bureau Veritas, Intertek)</w:t>
             </w:r>
           </w:p>
         </w:tc>
@@ -1458,7 +1447,7 @@
           <w:p>
             <w:pPr>
               <w:pStyle w:val="Normal"/>
-              <w:spacing w:lineRule="auto" w:line="252" w:before="0" w:after="0"/>
+              <w:spacing w:lineRule="exact" w:line="252" w:before="0" w:after="0"/>
               <w:jc w:val="start"/>
               <w:rPr/>
             </w:pPr>
@@ -1473,13 +1462,15 @@
                 <w:sz w:val="19"/>
                 <w:szCs w:val="19"/>
               </w:rPr>
-              <w:t>Nhân chứng chuyên môn độc lập, không phải người phán xử. Xác định số lượng/chất lượng tại điểm giao nhận; nộp inspection report có hash xác thực, không sửa được sau khi submit</w:t>
+              <w:t>Nhân chứng chuyên môn độc lập, không phải người phán xử. Xác định số lượng/chất lượng tại điểm giao nhận; nộp inspection report với cam kết hash để phát hiện thay đổi sau khi submit</w:t>
             </w:r>
           </w:p>
         </w:tc>
       </w:tr>
       <w:tr>
-        <w:trPr/>
+        <w:trPr>
+          <w:cantSplit w:val="true"/>
+        </w:trPr>
         <w:tc>
           <w:tcPr>
             <w:tcW w:w="2708" w:type="dxa"/>
@@ -1494,7 +1485,7 @@
           <w:p>
             <w:pPr>
               <w:pStyle w:val="Normal"/>
-              <w:spacing w:lineRule="auto" w:line="252" w:before="0" w:after="0"/>
+              <w:spacing w:lineRule="exact" w:line="252" w:before="0" w:after="0"/>
               <w:jc w:val="start"/>
               <w:rPr/>
             </w:pPr>
@@ -1527,7 +1518,7 @@
           <w:p>
             <w:pPr>
               <w:pStyle w:val="Normal"/>
-              <w:spacing w:lineRule="auto" w:line="252" w:before="0" w:after="0"/>
+              <w:spacing w:lineRule="exact" w:line="252" w:before="0" w:after="0"/>
               <w:jc w:val="start"/>
               <w:rPr/>
             </w:pPr>
@@ -1542,7 +1533,7 @@
                 <w:sz w:val="19"/>
                 <w:szCs w:val="19"/>
               </w:rPr>
-              <w:t>Ngân hàng thương mại được NHNN cấp phép (Agribank/BIDV)</w:t>
+              <w:t>Custodian/tổ chức tín dụng được phép theo mô hình pilot</w:t>
             </w:r>
           </w:p>
         </w:tc>
@@ -1560,7 +1551,7 @@
           <w:p>
             <w:pPr>
               <w:pStyle w:val="Normal"/>
-              <w:spacing w:lineRule="auto" w:line="252" w:before="0" w:after="0"/>
+              <w:spacing w:lineRule="exact" w:line="252" w:before="0" w:after="0"/>
               <w:jc w:val="start"/>
               <w:rPr/>
             </w:pPr>
@@ -1575,7 +1566,7 @@
                 <w:sz w:val="19"/>
                 <w:szCs w:val="19"/>
               </w:rPr>
-              <w:t>Không phải người dùng nền tảng. Giữ tiền thật; nền tảng chỉ gửi lệnh khoá/giải ngân/phạt. Cấu trúc này loại bỏ rủi ro vi phạm quy định trung gian thanh toán</w:t>
+              <w:t>Không phải người dùng nền tảng. Custodian giữ tiền thật; nền tảng chỉ gửi lệnh khoá/giải ngân theo điều kiện đã xác định. Cấu trúc này có thể giúp phân định custody khỏi platform, nhưng không tự kết luận mô hình đã đáp ứng mọi yêu cầu cấp phép [28], [29]</w:t>
             </w:r>
           </w:p>
         </w:tc>
@@ -1584,7 +1575,40 @@
     <w:p>
       <w:pPr>
         <w:pStyle w:val="Normal"/>
-        <w:spacing w:lineRule="auto" w:line="276" w:before="0" w:after="120"/>
+        <w:pBdr>
+          <w:left w:val="single" w:sz="18" w:space="12" w:color="9CA3AF"/>
+        </w:pBdr>
+        <w:spacing w:lineRule="exact" w:line="276" w:before="120" w:after="40"/>
+        <w:ind w:start="360"/>
+        <w:rPr/>
+      </w:pPr>
+      <w:r>
+        <w:rPr>
+          <w:rFonts w:eastAsia="Calibri" w:cs="Calibri"/>
+          <w:i/>
+          <w:iCs/>
+          <w:color w:val="374151"/>
+          <w:sz w:val="21"/>
+          <w:szCs w:val="21"/>
+        </w:rPr>
+        <w:t>“</w:t>
+      </w:r>
+      <w:r>
+        <w:rPr>
+          <w:rFonts w:eastAsia="Calibri" w:cs="Calibri"/>
+          <w:i/>
+          <w:iCs/>
+          <w:color w:val="374151"/>
+          <w:sz w:val="21"/>
+          <w:szCs w:val="21"/>
+        </w:rPr>
+        <w:t>Lưu ý về danh tính tổ chức. Các tên hiệp hội, doanh nghiệp thu mua và tổ chức giám định nêu trong bảng chỉ là ví dụ minh hoạ persona hệ sinh thái; không hàm ý các tổ chức này đã hợp tác, xác nhận nhu cầu hoặc đã tích hợp với AgriContract.”</w:t>
+      </w:r>
+    </w:p>
+    <w:p>
+      <w:pPr>
+        <w:pStyle w:val="Normal"/>
+        <w:spacing w:lineRule="exact" w:line="276" w:before="0" w:after="120"/>
         <w:jc w:val="both"/>
         <w:rPr/>
       </w:pPr>
@@ -1599,20 +1623,20 @@
           <w:sz w:val="21"/>
           <w:szCs w:val="21"/>
         </w:rPr>
-        <w:t>Vì sao bán cho hiệp hội, không bán trực tiếp cho HTX.</w:t>
-      </w:r>
-      <w:r>
-        <w:rPr>
-          <w:rFonts w:eastAsia="Calibri" w:cs="Calibri"/>
-          <w:b w:val="false"/>
-          <w:bCs w:val="false"/>
-          <w:i w:val="false"/>
-          <w:iCs w:val="false"/>
-          <w:color w:val="111827"/>
-          <w:sz w:val="21"/>
-          <w:szCs w:val="21"/>
-        </w:rPr>
-        <w:t xml:space="preserve"> HTX nhỏ không mua phần mềm. Hiệp hội hoặc doanh nghiệp thu mua lớn triển khai nền tảng, thành viên của họ sử dụng. Cách này cũng giải quyết bài toán niềm tin: HTX không cần tin một startup mới — họ tin VICOFA/VRA đã triển khai nền tảng. Khi ngân hàng giữ tiền, niềm tin hoàn toàn độc lập với uy tín thương hiệu của nền tảng.</w:t>
+        <w:t>Giả thuyết kênh phân phối qua hiệp hội.</w:t>
+      </w:r>
+      <w:r>
+        <w:rPr>
+          <w:rFonts w:eastAsia="Calibri" w:cs="Calibri"/>
+          <w:b w:val="false"/>
+          <w:bCs w:val="false"/>
+          <w:i w:val="false"/>
+          <w:iCs w:val="false"/>
+          <w:color w:val="111827"/>
+          <w:sz w:val="21"/>
+          <w:szCs w:val="21"/>
+        </w:rPr>
+        <w:t xml:space="preserve"> Nghiên cứu về HTX Việt Nam ghi nhận khác biệt về quy mô, năng lực quản trị và nguồn lực; willingness-to-pay và năng lực mua phần mềm của nhóm HTX nhỏ chưa được kiểm chứng. Vì vậy mô hình đề xuất là để hiệp hội hoặc doanh nghiệp thu mua lớn làm anchor buyer, sau đó đo adoption, WTP và mức hỗ trợ vận hành của HTX trong pilot. [15], [16]</w:t>
       </w:r>
     </w:p>
     <w:p>
@@ -1621,7 +1645,7 @@
         <w:spacing w:before="180" w:after="60"/>
         <w:rPr/>
       </w:pPr>
-      <w:bookmarkStart w:id="3" w:name="__RefHeading___Toc498_AgriContract"/>
+      <w:bookmarkStart w:id="3" w:name="__RefHeading___Toc499_AgriContract"/>
       <w:bookmarkEnd w:id="3"/>
       <w:r>
         <w:rPr>
@@ -1638,7 +1662,7 @@
     <w:p>
       <w:pPr>
         <w:pStyle w:val="Normal"/>
-        <w:spacing w:lineRule="auto" w:line="276" w:before="0" w:after="120"/>
+        <w:spacing w:lineRule="exact" w:line="276" w:before="0" w:after="120"/>
         <w:jc w:val="both"/>
         <w:rPr/>
       </w:pPr>
@@ -1659,7 +1683,7 @@
     <w:p>
       <w:pPr>
         <w:pStyle w:val="Normal"/>
-        <w:spacing w:lineRule="auto" w:line="276" w:before="0" w:after="60"/>
+        <w:spacing w:lineRule="exact" w:line="276" w:before="0" w:after="60"/>
         <w:ind w:hanging="220" w:start="360"/>
         <w:jc w:val="both"/>
         <w:rPr/>
@@ -1681,7 +1705,7 @@
     <w:p>
       <w:pPr>
         <w:pStyle w:val="Normal"/>
-        <w:spacing w:lineRule="auto" w:line="276" w:before="0" w:after="60"/>
+        <w:spacing w:lineRule="exact" w:line="276" w:before="0" w:after="60"/>
         <w:ind w:hanging="220" w:start="360"/>
         <w:jc w:val="both"/>
         <w:rPr/>
@@ -1697,13 +1721,13 @@
           <w:sz w:val="21"/>
           <w:szCs w:val="21"/>
         </w:rPr>
-        <w:t>2. Mọi quyết định vận hành của OPERATOR/ADMIN được ghi vào audit trail không thể xoá/sửa sau khi submit; hành động override bị đánh dấu vĩnh viễn.</w:t>
+        <w:t>2. Mọi quyết định vận hành của OPERATOR/ADMIN được ghi vào audit trail append-only; hành động override được đánh dấu và có thể phát hiện nếu dữ liệu bị thay đổi.</w:t>
       </w:r>
     </w:p>
     <w:p>
       <w:pPr>
         <w:pStyle w:val="Normal"/>
-        <w:spacing w:lineRule="auto" w:line="276" w:before="0" w:after="120"/>
+        <w:spacing w:lineRule="exact" w:line="276" w:before="0" w:after="120"/>
         <w:jc w:val="both"/>
         <w:rPr/>
       </w:pPr>
@@ -1718,7 +1742,7 @@
           <w:sz w:val="21"/>
           <w:szCs w:val="21"/>
         </w:rPr>
-        <w:t>Khuyến nghị vận hành: ưu tiên triển khai qua hiệp hội ngành hàng — bên trung lập, không có lợi ích đối lập với Buyer hay Seller trong từng giao dịch — để loại bỏ xung đột lợi ích ngay từ mô hình phân phối.</w:t>
+        <w:t>Khuyến nghị vận hành: có thể thử triển khai qua hiệp hội ngành hàng, nhưng không mặc định hiệp hội luôn trung lập hoặc loại bỏ xung đột lợi ích; mỗi pilot cần ghi nhận vai trò, quyền truy cập và cơ chế recusal cụ thể.</w:t>
       </w:r>
     </w:p>
     <w:p>
@@ -1730,7 +1754,7 @@
         <w:spacing w:before="320" w:after="120"/>
         <w:rPr/>
       </w:pPr>
-      <w:bookmarkStart w:id="4" w:name="__RefHeading___Toc500_AgriContract"/>
+      <w:bookmarkStart w:id="4" w:name="__RefHeading___Toc501_AgriContract"/>
       <w:bookmarkEnd w:id="4"/>
       <w:r>
         <w:rPr>
@@ -1750,7 +1774,7 @@
         <w:spacing w:before="240" w:after="80"/>
         <w:rPr/>
       </w:pPr>
-      <w:bookmarkStart w:id="5" w:name="__RefHeading___Toc502_AgriContract"/>
+      <w:bookmarkStart w:id="5" w:name="__RefHeading___Toc503_AgriContract"/>
       <w:bookmarkEnd w:id="5"/>
       <w:r>
         <w:rPr>
@@ -1767,7 +1791,7 @@
     <w:p>
       <w:pPr>
         <w:pStyle w:val="Normal"/>
-        <w:spacing w:lineRule="auto" w:line="276" w:before="0" w:after="60"/>
+        <w:spacing w:lineRule="exact" w:line="276" w:before="0" w:after="60"/>
         <w:ind w:hanging="220" w:start="360"/>
         <w:jc w:val="both"/>
         <w:rPr/>
@@ -1789,7 +1813,7 @@
     <w:p>
       <w:pPr>
         <w:pStyle w:val="Normal"/>
-        <w:spacing w:lineRule="auto" w:line="276" w:before="0" w:after="60"/>
+        <w:spacing w:lineRule="exact" w:line="276" w:before="0" w:after="60"/>
         <w:ind w:hanging="220" w:start="360"/>
         <w:jc w:val="both"/>
         <w:rPr/>
@@ -1863,7 +1887,7 @@
     <w:p>
       <w:pPr>
         <w:pStyle w:val="Normal"/>
-        <w:spacing w:lineRule="auto" w:line="276" w:before="0" w:after="60"/>
+        <w:spacing w:lineRule="exact" w:line="276" w:before="0" w:after="60"/>
         <w:ind w:hanging="220" w:start="360"/>
         <w:jc w:val="both"/>
         <w:rPr/>
@@ -1937,7 +1961,7 @@
     <w:p>
       <w:pPr>
         <w:pStyle w:val="Normal"/>
-        <w:spacing w:lineRule="auto" w:line="276" w:before="0" w:after="60"/>
+        <w:spacing w:lineRule="exact" w:line="276" w:before="0" w:after="60"/>
         <w:ind w:hanging="220" w:start="360"/>
         <w:jc w:val="both"/>
         <w:rPr/>
@@ -2011,7 +2035,7 @@
     <w:p>
       <w:pPr>
         <w:pStyle w:val="Normal"/>
-        <w:spacing w:lineRule="auto" w:line="276" w:before="0" w:after="60"/>
+        <w:spacing w:lineRule="exact" w:line="276" w:before="0" w:after="60"/>
         <w:ind w:hanging="220" w:start="360"/>
         <w:jc w:val="both"/>
         <w:rPr/>
@@ -2111,7 +2135,7 @@
     <w:p>
       <w:pPr>
         <w:pStyle w:val="Normal"/>
-        <w:spacing w:lineRule="auto" w:line="276" w:before="0" w:after="60"/>
+        <w:spacing w:lineRule="exact" w:line="276" w:before="0" w:after="60"/>
         <w:ind w:hanging="220" w:start="360"/>
         <w:jc w:val="both"/>
         <w:rPr/>
@@ -2133,7 +2157,7 @@
     <w:p>
       <w:pPr>
         <w:pStyle w:val="Normal"/>
-        <w:spacing w:lineRule="auto" w:line="276" w:before="0" w:after="60"/>
+        <w:spacing w:lineRule="exact" w:line="276" w:before="0" w:after="60"/>
         <w:ind w:hanging="220" w:start="360"/>
         <w:jc w:val="both"/>
         <w:rPr/>
@@ -2155,7 +2179,7 @@
     <w:p>
       <w:pPr>
         <w:pStyle w:val="Normal"/>
-        <w:spacing w:lineRule="auto" w:line="276" w:before="0" w:after="60"/>
+        <w:spacing w:lineRule="exact" w:line="276" w:before="0" w:after="60"/>
         <w:ind w:hanging="220" w:start="360"/>
         <w:jc w:val="both"/>
         <w:rPr/>
@@ -2171,7 +2195,7 @@
           <w:sz w:val="21"/>
           <w:szCs w:val="21"/>
         </w:rPr>
-        <w:t xml:space="preserve">8. Mọi hậu quả tiền/uy tín cuối cùng hội tụ tại </w:t>
+        <w:t xml:space="preserve">8. Hậu quả chế tài và uy tín cuối cùng hội tụ tại </w:t>
       </w:r>
       <w:r>
         <w:rPr>
@@ -2203,7 +2227,7 @@
     <w:p>
       <w:pPr>
         <w:pStyle w:val="Normal"/>
-        <w:spacing w:lineRule="auto" w:line="276" w:before="0" w:after="60"/>
+        <w:spacing w:lineRule="exact" w:line="276" w:before="0" w:after="60"/>
         <w:ind w:hanging="220" w:start="360"/>
         <w:jc w:val="both"/>
         <w:rPr/>
@@ -2280,7 +2304,7 @@
         <w:spacing w:before="240" w:after="80"/>
         <w:rPr/>
       </w:pPr>
-      <w:bookmarkStart w:id="6" w:name="__RefHeading___Toc504_AgriContract"/>
+      <w:bookmarkStart w:id="6" w:name="__RefHeading___Toc505_AgriContract"/>
       <w:bookmarkEnd w:id="6"/>
       <w:r>
         <w:rPr>
@@ -2297,7 +2321,7 @@
     <w:p>
       <w:pPr>
         <w:pStyle w:val="Normal"/>
-        <w:spacing w:lineRule="auto" w:line="276" w:before="0" w:after="120"/>
+        <w:spacing w:lineRule="exact" w:line="276" w:before="0" w:after="120"/>
         <w:jc w:val="both"/>
         <w:rPr/>
       </w:pPr>
@@ -2648,6 +2672,7 @@
       <w:tr>
         <w:trPr>
           <w:tblHeader w:val="true"/>
+          <w:cantSplit w:val="true"/>
         </w:trPr>
         <w:tc>
           <w:tcPr>
@@ -2664,7 +2689,7 @@
           <w:p>
             <w:pPr>
               <w:pStyle w:val="Normal"/>
-              <w:spacing w:lineRule="auto" w:line="252" w:before="0" w:after="0"/>
+              <w:spacing w:lineRule="exact" w:line="252" w:before="0" w:after="0"/>
               <w:jc w:val="start"/>
               <w:rPr/>
             </w:pPr>
@@ -2698,7 +2723,7 @@
           <w:p>
             <w:pPr>
               <w:pStyle w:val="Normal"/>
-              <w:spacing w:lineRule="auto" w:line="252" w:before="0" w:after="0"/>
+              <w:spacing w:lineRule="exact" w:line="252" w:before="0" w:after="0"/>
               <w:jc w:val="start"/>
               <w:rPr/>
             </w:pPr>
@@ -2732,7 +2757,7 @@
           <w:p>
             <w:pPr>
               <w:pStyle w:val="Normal"/>
-              <w:spacing w:lineRule="auto" w:line="252" w:before="0" w:after="0"/>
+              <w:spacing w:lineRule="exact" w:line="252" w:before="0" w:after="0"/>
               <w:jc w:val="start"/>
               <w:rPr/>
             </w:pPr>
@@ -2753,7 +2778,9 @@
         </w:tc>
       </w:tr>
       <w:tr>
-        <w:trPr/>
+        <w:trPr>
+          <w:cantSplit w:val="true"/>
+        </w:trPr>
         <w:tc>
           <w:tcPr>
             <w:tcW w:w="2855" w:type="dxa"/>
@@ -2768,7 +2795,7 @@
           <w:p>
             <w:pPr>
               <w:pStyle w:val="Normal"/>
-              <w:spacing w:lineRule="auto" w:line="252" w:before="0" w:after="0"/>
+              <w:spacing w:lineRule="exact" w:line="252" w:before="0" w:after="0"/>
               <w:jc w:val="start"/>
               <w:rPr/>
             </w:pPr>
@@ -2801,7 +2828,7 @@
           <w:p>
             <w:pPr>
               <w:pStyle w:val="Normal"/>
-              <w:spacing w:lineRule="auto" w:line="252" w:before="0" w:after="0"/>
+              <w:spacing w:lineRule="exact" w:line="252" w:before="0" w:after="0"/>
               <w:jc w:val="start"/>
               <w:rPr/>
             </w:pPr>
@@ -2834,7 +2861,7 @@
           <w:p>
             <w:pPr>
               <w:pStyle w:val="Normal"/>
-              <w:spacing w:lineRule="auto" w:line="252" w:before="0" w:after="0"/>
+              <w:spacing w:lineRule="exact" w:line="252" w:before="0" w:after="0"/>
               <w:jc w:val="start"/>
               <w:rPr/>
             </w:pPr>
@@ -2881,7 +2908,9 @@
         </w:tc>
       </w:tr>
       <w:tr>
-        <w:trPr/>
+        <w:trPr>
+          <w:cantSplit w:val="true"/>
+        </w:trPr>
         <w:tc>
           <w:tcPr>
             <w:tcW w:w="2855" w:type="dxa"/>
@@ -2897,7 +2926,7 @@
           <w:p>
             <w:pPr>
               <w:pStyle w:val="Normal"/>
-              <w:spacing w:lineRule="auto" w:line="252" w:before="0" w:after="0"/>
+              <w:spacing w:lineRule="exact" w:line="252" w:before="0" w:after="0"/>
               <w:jc w:val="start"/>
               <w:rPr/>
             </w:pPr>
@@ -2931,7 +2960,7 @@
           <w:p>
             <w:pPr>
               <w:pStyle w:val="Normal"/>
-              <w:spacing w:lineRule="auto" w:line="252" w:before="0" w:after="0"/>
+              <w:spacing w:lineRule="exact" w:line="252" w:before="0" w:after="0"/>
               <w:jc w:val="start"/>
               <w:rPr/>
             </w:pPr>
@@ -2965,7 +2994,7 @@
           <w:p>
             <w:pPr>
               <w:pStyle w:val="Normal"/>
-              <w:spacing w:lineRule="auto" w:line="252" w:before="0" w:after="0"/>
+              <w:spacing w:lineRule="exact" w:line="252" w:before="0" w:after="0"/>
               <w:jc w:val="start"/>
               <w:rPr/>
             </w:pPr>
@@ -2999,7 +3028,9 @@
         </w:tc>
       </w:tr>
       <w:tr>
-        <w:trPr/>
+        <w:trPr>
+          <w:cantSplit w:val="true"/>
+        </w:trPr>
         <w:tc>
           <w:tcPr>
             <w:tcW w:w="2855" w:type="dxa"/>
@@ -3014,7 +3045,7 @@
           <w:p>
             <w:pPr>
               <w:pStyle w:val="Normal"/>
-              <w:spacing w:lineRule="auto" w:line="252" w:before="0" w:after="0"/>
+              <w:spacing w:lineRule="exact" w:line="252" w:before="0" w:after="0"/>
               <w:jc w:val="start"/>
               <w:rPr/>
             </w:pPr>
@@ -3047,7 +3078,7 @@
           <w:p>
             <w:pPr>
               <w:pStyle w:val="Normal"/>
-              <w:spacing w:lineRule="auto" w:line="252" w:before="0" w:after="0"/>
+              <w:spacing w:lineRule="exact" w:line="252" w:before="0" w:after="0"/>
               <w:jc w:val="start"/>
               <w:rPr/>
             </w:pPr>
@@ -3080,7 +3111,7 @@
           <w:p>
             <w:pPr>
               <w:pStyle w:val="Normal"/>
-              <w:spacing w:lineRule="auto" w:line="252" w:before="0" w:after="0"/>
+              <w:spacing w:lineRule="exact" w:line="252" w:before="0" w:after="0"/>
               <w:jc w:val="start"/>
               <w:rPr/>
             </w:pPr>
@@ -3127,7 +3158,9 @@
         </w:tc>
       </w:tr>
       <w:tr>
-        <w:trPr/>
+        <w:trPr>
+          <w:cantSplit w:val="true"/>
+        </w:trPr>
         <w:tc>
           <w:tcPr>
             <w:tcW w:w="2855" w:type="dxa"/>
@@ -3143,7 +3176,7 @@
           <w:p>
             <w:pPr>
               <w:pStyle w:val="Normal"/>
-              <w:spacing w:lineRule="auto" w:line="252" w:before="0" w:after="0"/>
+              <w:spacing w:lineRule="exact" w:line="252" w:before="0" w:after="0"/>
               <w:jc w:val="start"/>
               <w:rPr/>
             </w:pPr>
@@ -3177,7 +3210,7 @@
           <w:p>
             <w:pPr>
               <w:pStyle w:val="Normal"/>
-              <w:spacing w:lineRule="auto" w:line="252" w:before="0" w:after="0"/>
+              <w:spacing w:lineRule="exact" w:line="252" w:before="0" w:after="0"/>
               <w:jc w:val="start"/>
               <w:rPr/>
             </w:pPr>
@@ -3211,7 +3244,7 @@
           <w:p>
             <w:pPr>
               <w:pStyle w:val="Normal"/>
-              <w:spacing w:lineRule="auto" w:line="252" w:before="0" w:after="0"/>
+              <w:spacing w:lineRule="exact" w:line="252" w:before="0" w:after="0"/>
               <w:jc w:val="start"/>
               <w:rPr/>
             </w:pPr>
@@ -3310,7 +3343,9 @@
         </w:tc>
       </w:tr>
       <w:tr>
-        <w:trPr/>
+        <w:trPr>
+          <w:cantSplit w:val="true"/>
+        </w:trPr>
         <w:tc>
           <w:tcPr>
             <w:tcW w:w="2855" w:type="dxa"/>
@@ -3325,7 +3360,7 @@
           <w:p>
             <w:pPr>
               <w:pStyle w:val="Normal"/>
-              <w:spacing w:lineRule="auto" w:line="252" w:before="0" w:after="0"/>
+              <w:spacing w:lineRule="exact" w:line="252" w:before="0" w:after="0"/>
               <w:jc w:val="start"/>
               <w:rPr/>
             </w:pPr>
@@ -3358,7 +3393,7 @@
           <w:p>
             <w:pPr>
               <w:pStyle w:val="Normal"/>
-              <w:spacing w:lineRule="auto" w:line="252" w:before="0" w:after="0"/>
+              <w:spacing w:lineRule="exact" w:line="252" w:before="0" w:after="0"/>
               <w:jc w:val="start"/>
               <w:rPr/>
             </w:pPr>
@@ -3391,7 +3426,7 @@
           <w:p>
             <w:pPr>
               <w:pStyle w:val="Normal"/>
-              <w:spacing w:lineRule="auto" w:line="252" w:before="0" w:after="0"/>
+              <w:spacing w:lineRule="exact" w:line="252" w:before="0" w:after="0"/>
               <w:jc w:val="start"/>
               <w:rPr/>
             </w:pPr>
@@ -3412,7 +3447,9 @@
         </w:tc>
       </w:tr>
       <w:tr>
-        <w:trPr/>
+        <w:trPr>
+          <w:cantSplit w:val="true"/>
+        </w:trPr>
         <w:tc>
           <w:tcPr>
             <w:tcW w:w="2855" w:type="dxa"/>
@@ -3428,7 +3465,7 @@
           <w:p>
             <w:pPr>
               <w:pStyle w:val="Normal"/>
-              <w:spacing w:lineRule="auto" w:line="252" w:before="0" w:after="0"/>
+              <w:spacing w:lineRule="exact" w:line="252" w:before="0" w:after="0"/>
               <w:jc w:val="start"/>
               <w:rPr/>
             </w:pPr>
@@ -3462,7 +3499,7 @@
           <w:p>
             <w:pPr>
               <w:pStyle w:val="Normal"/>
-              <w:spacing w:lineRule="auto" w:line="252" w:before="0" w:after="0"/>
+              <w:spacing w:lineRule="exact" w:line="252" w:before="0" w:after="0"/>
               <w:jc w:val="start"/>
               <w:rPr/>
             </w:pPr>
@@ -3496,7 +3533,7 @@
           <w:p>
             <w:pPr>
               <w:pStyle w:val="Normal"/>
-              <w:spacing w:lineRule="auto" w:line="252" w:before="0" w:after="0"/>
+              <w:spacing w:lineRule="exact" w:line="252" w:before="0" w:after="0"/>
               <w:jc w:val="start"/>
               <w:rPr/>
             </w:pPr>
@@ -3523,7 +3560,7 @@
         <w:spacing w:before="240" w:after="80"/>
         <w:rPr/>
       </w:pPr>
-      <w:bookmarkStart w:id="7" w:name="__RefHeading___Toc506_AgriContract"/>
+      <w:bookmarkStart w:id="7" w:name="__RefHeading___Toc507_AgriContract"/>
       <w:bookmarkEnd w:id="7"/>
       <w:r>
         <w:rPr>
@@ -3544,7 +3581,7 @@
           <w:ilvl w:val="0"/>
           <w:numId w:val="3"/>
         </w:numPr>
-        <w:spacing w:lineRule="auto" w:line="276" w:before="0" w:after="60"/>
+        <w:spacing w:lineRule="exact" w:line="276" w:before="0" w:after="60"/>
         <w:rPr/>
       </w:pPr>
       <w:r>
@@ -3581,7 +3618,7 @@
           <w:ilvl w:val="0"/>
           <w:numId w:val="1"/>
         </w:numPr>
-        <w:spacing w:lineRule="auto" w:line="276" w:before="0" w:after="60"/>
+        <w:spacing w:lineRule="exact" w:line="276" w:before="0" w:after="60"/>
         <w:rPr/>
       </w:pPr>
       <w:r>
@@ -3618,7 +3655,7 @@
           <w:ilvl w:val="0"/>
           <w:numId w:val="1"/>
         </w:numPr>
-        <w:spacing w:lineRule="auto" w:line="276" w:before="0" w:after="60"/>
+        <w:spacing w:lineRule="exact" w:line="276" w:before="0" w:after="60"/>
         <w:rPr/>
       </w:pPr>
       <w:r>
@@ -3651,7 +3688,7 @@
     <w:p>
       <w:pPr>
         <w:pStyle w:val="Normal"/>
-        <w:spacing w:lineRule="auto" w:line="276" w:before="0" w:after="120"/>
+        <w:spacing w:lineRule="exact" w:line="276" w:before="0" w:after="120"/>
         <w:jc w:val="both"/>
         <w:rPr/>
       </w:pPr>
@@ -3744,7 +3781,7 @@
           <w:sz w:val="21"/>
           <w:szCs w:val="21"/>
         </w:rPr>
-        <w:t xml:space="preserve">. Allegation chưa final không được chạm tiền hoặc tạo negative reputation. Kết quả no-fault có </w:t>
+        <w:t xml:space="preserve">. Allegation chưa final không được tạo ledger side effect hoặc negative reputation. Kết quả no-fault có </w:t>
       </w:r>
       <w:r>
         <w:rPr>
@@ -3805,7 +3842,7 @@
         <w:spacing w:before="240" w:after="80"/>
         <w:rPr/>
       </w:pPr>
-      <w:bookmarkStart w:id="8" w:name="__RefHeading___Toc508_AgriContract"/>
+      <w:bookmarkStart w:id="8" w:name="__RefHeading___Toc509_AgriContract"/>
       <w:bookmarkEnd w:id="8"/>
       <w:r>
         <w:rPr>
@@ -3822,7 +3859,7 @@
     <w:p>
       <w:pPr>
         <w:pStyle w:val="Normal"/>
-        <w:spacing w:lineRule="auto" w:line="276" w:before="0" w:after="120"/>
+        <w:spacing w:lineRule="exact" w:line="276" w:before="0" w:after="120"/>
         <w:jc w:val="both"/>
         <w:rPr/>
       </w:pPr>
@@ -3912,7 +3949,7 @@
           <w:ilvl w:val="0"/>
           <w:numId w:val="1"/>
         </w:numPr>
-        <w:spacing w:lineRule="auto" w:line="276" w:before="0" w:after="60"/>
+        <w:spacing w:lineRule="exact" w:line="276" w:before="0" w:after="60"/>
         <w:rPr/>
       </w:pPr>
       <w:r>
@@ -3975,7 +4012,7 @@
           <w:ilvl w:val="0"/>
           <w:numId w:val="1"/>
         </w:numPr>
-        <w:spacing w:lineRule="auto" w:line="276" w:before="0" w:after="60"/>
+        <w:spacing w:lineRule="exact" w:line="276" w:before="0" w:after="60"/>
         <w:rPr/>
       </w:pPr>
       <w:r>
@@ -4012,7 +4049,7 @@
           <w:ilvl w:val="0"/>
           <w:numId w:val="1"/>
         </w:numPr>
-        <w:spacing w:lineRule="auto" w:line="276" w:before="0" w:after="60"/>
+        <w:spacing w:lineRule="exact" w:line="276" w:before="0" w:after="60"/>
         <w:rPr/>
       </w:pPr>
       <w:r>
@@ -4075,7 +4112,7 @@
           <w:ilvl w:val="0"/>
           <w:numId w:val="1"/>
         </w:numPr>
-        <w:spacing w:lineRule="auto" w:line="276" w:before="0" w:after="60"/>
+        <w:spacing w:lineRule="exact" w:line="276" w:before="0" w:after="60"/>
         <w:rPr/>
       </w:pPr>
       <w:r>
@@ -4134,7 +4171,7 @@
     <w:p>
       <w:pPr>
         <w:pStyle w:val="Normal"/>
-        <w:spacing w:lineRule="auto" w:line="276" w:before="0" w:after="120"/>
+        <w:spacing w:lineRule="exact" w:line="276" w:before="0" w:after="120"/>
         <w:jc w:val="both"/>
         <w:rPr/>
       </w:pPr>
@@ -4236,7 +4273,7 @@
         <w:spacing w:before="240" w:after="80"/>
         <w:rPr/>
       </w:pPr>
-      <w:bookmarkStart w:id="9" w:name="__RefHeading___Toc510_AgriContract"/>
+      <w:bookmarkStart w:id="9" w:name="__RefHeading___Toc511_AgriContract"/>
       <w:bookmarkEnd w:id="9"/>
       <w:r>
         <w:rPr>
@@ -4253,7 +4290,7 @@
     <w:p>
       <w:pPr>
         <w:pStyle w:val="Normal"/>
-        <w:spacing w:lineRule="auto" w:line="276" w:before="0" w:after="120"/>
+        <w:spacing w:lineRule="exact" w:line="276" w:before="0" w:after="120"/>
         <w:jc w:val="both"/>
         <w:rPr/>
       </w:pPr>
@@ -4508,7 +4545,7 @@
     <w:p>
       <w:pPr>
         <w:pStyle w:val="Normal"/>
-        <w:spacing w:lineRule="auto" w:line="276" w:before="0" w:after="120"/>
+        <w:spacing w:lineRule="exact" w:line="276" w:before="0" w:after="120"/>
         <w:jc w:val="both"/>
         <w:rPr/>
       </w:pPr>
@@ -4558,7 +4595,7 @@
         <w:spacing w:before="240" w:after="80"/>
         <w:rPr/>
       </w:pPr>
-      <w:bookmarkStart w:id="10" w:name="__RefHeading___Toc512_AgriContract"/>
+      <w:bookmarkStart w:id="10" w:name="__RefHeading___Toc513_AgriContract"/>
       <w:bookmarkEnd w:id="10"/>
       <w:r>
         <w:rPr>
@@ -4575,7 +4612,7 @@
     <w:p>
       <w:pPr>
         <w:pStyle w:val="Normal"/>
-        <w:spacing w:lineRule="auto" w:line="276" w:before="0" w:after="120"/>
+        <w:spacing w:lineRule="exact" w:line="276" w:before="0" w:after="120"/>
         <w:jc w:val="both"/>
         <w:rPr/>
       </w:pPr>
@@ -4628,7 +4665,7 @@
         <w:spacing w:before="320" w:after="120"/>
         <w:rPr/>
       </w:pPr>
-      <w:bookmarkStart w:id="11" w:name="__RefHeading___Toc514_AgriContract"/>
+      <w:bookmarkStart w:id="11" w:name="__RefHeading___Toc515_AgriContract"/>
       <w:bookmarkEnd w:id="11"/>
       <w:r>
         <w:rPr>
@@ -4649,7 +4686,7 @@
           <w:ilvl w:val="0"/>
           <w:numId w:val="1"/>
         </w:numPr>
-        <w:spacing w:lineRule="auto" w:line="276" w:before="0" w:after="60"/>
+        <w:spacing w:lineRule="exact" w:line="276" w:before="0" w:after="60"/>
         <w:rPr/>
       </w:pPr>
       <w:r>
@@ -4686,7 +4723,7 @@
           <w:ilvl w:val="0"/>
           <w:numId w:val="1"/>
         </w:numPr>
-        <w:spacing w:lineRule="auto" w:line="276" w:before="0" w:after="60"/>
+        <w:spacing w:lineRule="exact" w:line="276" w:before="0" w:after="60"/>
         <w:rPr/>
       </w:pPr>
       <w:r>
@@ -4749,7 +4786,7 @@
           <w:ilvl w:val="0"/>
           <w:numId w:val="1"/>
         </w:numPr>
-        <w:spacing w:lineRule="auto" w:line="276" w:before="0" w:after="60"/>
+        <w:spacing w:lineRule="exact" w:line="276" w:before="0" w:after="60"/>
         <w:rPr/>
       </w:pPr>
       <w:r>
@@ -4808,7 +4845,7 @@
     <w:p>
       <w:pPr>
         <w:pStyle w:val="Normal"/>
-        <w:spacing w:lineRule="auto" w:line="276" w:before="0" w:after="120"/>
+        <w:spacing w:lineRule="exact" w:line="276" w:before="0" w:after="120"/>
         <w:jc w:val="both"/>
         <w:rPr/>
       </w:pPr>
@@ -4835,7 +4872,7 @@
         <w:spacing w:before="320" w:after="120"/>
         <w:rPr/>
       </w:pPr>
-      <w:bookmarkStart w:id="12" w:name="__RefHeading___Toc516_AgriContract"/>
+      <w:bookmarkStart w:id="12" w:name="__RefHeading___Toc517_AgriContract"/>
       <w:bookmarkEnd w:id="12"/>
       <w:r>
         <w:rPr>
@@ -4852,7 +4889,7 @@
     <w:p>
       <w:pPr>
         <w:pStyle w:val="Normal"/>
-        <w:spacing w:lineRule="auto" w:line="276" w:before="0" w:after="120"/>
+        <w:spacing w:lineRule="exact" w:line="276" w:before="0" w:after="120"/>
         <w:jc w:val="both"/>
         <w:rPr/>
       </w:pPr>
@@ -5049,13 +5086,13 @@
           <w:sz w:val="21"/>
           <w:szCs w:val="21"/>
         </w:rPr>
-        <w:t xml:space="preserve"> trong payload.</w:t>
+        <w:t xml:space="preserve"> trong payload. Reputation là tín hiệu từ các fact đã ghi nhận, có thể chịu bias, cold-start và dispute; không phải thước đo hoàn hảo về uy tín hay sự thật. [18], [20]</w:t>
       </w:r>
     </w:p>
     <w:p>
       <w:pPr>
         <w:pStyle w:val="Normal"/>
-        <w:spacing w:lineRule="auto" w:line="276" w:before="0" w:after="120"/>
+        <w:spacing w:lineRule="exact" w:line="276" w:before="0" w:after="120"/>
         <w:jc w:val="both"/>
         <w:rPr/>
       </w:pPr>
@@ -5161,13 +5198,13 @@
           <w:sz w:val="21"/>
           <w:szCs w:val="21"/>
         </w:rPr>
-        <w:t xml:space="preserve"> để không bị event cũ ghi đè sau restart. Completion/dispute facts được lưu bất biến; score được tính khi query, không persist như chân lý cố định.</w:t>
+        <w:t xml:space="preserve"> để không bị event cũ ghi đè sau restart. Completion/dispute facts được lưu append-only ở tầng ứng dụng (bất biến theo invariant thiết kế); score được tính khi query, không persist như chân lý cố định.</w:t>
       </w:r>
     </w:p>
     <w:p>
       <w:pPr>
         <w:pStyle w:val="Normal"/>
-        <w:spacing w:lineRule="auto" w:line="276" w:before="0" w:after="120"/>
+        <w:spacing w:lineRule="exact" w:line="276" w:before="0" w:after="120"/>
         <w:jc w:val="both"/>
         <w:rPr/>
       </w:pPr>
@@ -5220,7 +5257,7 @@
         <w:spacing w:before="320" w:after="120"/>
         <w:rPr/>
       </w:pPr>
-      <w:bookmarkStart w:id="13" w:name="__RefHeading___Toc518_AgriContract"/>
+      <w:bookmarkStart w:id="13" w:name="__RefHeading___Toc519_AgriContract"/>
       <w:bookmarkEnd w:id="13"/>
       <w:r>
         <w:rPr>
@@ -5237,7 +5274,7 @@
     <w:p>
       <w:pPr>
         <w:pStyle w:val="Normal"/>
-        <w:spacing w:lineRule="auto" w:line="276" w:before="0" w:after="120"/>
+        <w:spacing w:lineRule="exact" w:line="276" w:before="0" w:after="120"/>
         <w:jc w:val="both"/>
         <w:rPr/>
       </w:pPr>
@@ -5362,7 +5399,7 @@
     <w:p>
       <w:pPr>
         <w:pStyle w:val="Normal"/>
-        <w:spacing w:lineRule="auto" w:line="276" w:before="0" w:after="120"/>
+        <w:spacing w:lineRule="exact" w:line="276" w:before="0" w:after="120"/>
         <w:jc w:val="both"/>
         <w:rPr/>
       </w:pPr>
@@ -5377,13 +5414,13 @@
           <w:sz w:val="21"/>
           <w:szCs w:val="21"/>
         </w:rPr>
-        <w:t>Bằng chứng có thể được đối chiếu ở nhiều vị trí: chain trong database, digest/anchor và OpenTimestamps theo thiết kế. Đây là cơ chế phát hiện sửa đổi, không chứng minh nội dung khai báo là đúng hay giao dịch hợp pháp.</w:t>
+        <w:t>Bằng chứng có thể được đối chiếu ở nhiều vị trí: chain trong database, digest/anchor và OpenTimestamps theo thiết kế. Đây là cơ chế phát hiện sửa đổi so với checkpoint/anchor được giữ ngoài quyền quản trị cơ sở dữ liệu; nó không chống được kịch bản một actor có đặc quyền viết lại toàn chuỗi trong cùng trust domain, và không chứng minh nội dung khai báo là đúng hay giao dịch hợp pháp.</w:t>
       </w:r>
     </w:p>
     <w:p>
       <w:pPr>
         <w:pStyle w:val="Normal"/>
-        <w:spacing w:lineRule="auto" w:line="276" w:before="0" w:after="120"/>
+        <w:spacing w:lineRule="exact" w:line="276" w:before="0" w:after="120"/>
         <w:jc w:val="both"/>
         <w:rPr/>
       </w:pPr>
@@ -5462,7 +5499,7 @@
         <w:spacing w:before="320" w:after="120"/>
         <w:rPr/>
       </w:pPr>
-      <w:bookmarkStart w:id="14" w:name="__RefHeading___Toc520_AgriContract"/>
+      <w:bookmarkStart w:id="14" w:name="__RefHeading___Toc521_AgriContract"/>
       <w:bookmarkEnd w:id="14"/>
       <w:r>
         <w:rPr>
@@ -5482,7 +5519,7 @@
         <w:spacing w:before="240" w:after="80"/>
         <w:rPr/>
       </w:pPr>
-      <w:bookmarkStart w:id="15" w:name="__RefHeading___Toc522_AgriContract"/>
+      <w:bookmarkStart w:id="15" w:name="__RefHeading___Toc523_AgriContract"/>
       <w:bookmarkEnd w:id="15"/>
       <w:r>
         <w:rPr>
@@ -5499,7 +5536,7 @@
     <w:p>
       <w:pPr>
         <w:pStyle w:val="Normal"/>
-        <w:spacing w:lineRule="auto" w:line="276" w:before="0" w:after="120"/>
+        <w:spacing w:lineRule="exact" w:line="276" w:before="0" w:after="120"/>
         <w:jc w:val="both"/>
         <w:rPr/>
       </w:pPr>
@@ -5741,7 +5778,7 @@
     <w:p>
       <w:pPr>
         <w:pStyle w:val="Normal"/>
-        <w:spacing w:lineRule="auto" w:line="276" w:before="0" w:after="120"/>
+        <w:spacing w:lineRule="exact" w:line="276" w:before="0" w:after="120"/>
         <w:jc w:val="both"/>
         <w:rPr/>
       </w:pPr>
@@ -5756,7 +5793,7 @@
           <w:sz w:val="21"/>
           <w:szCs w:val="21"/>
         </w:rPr>
-        <w:t>Phân loại deposit theo BLDS Điều 328, tiền phong toả/ký quỹ tại tổ chức tín dụng theo Điều 330 và quan hệ penalty–damages phải được legal validation cho mẫu hợp đồng pilot. Hệ thống không tự suy “cọc = phạt” và không coi mọi chấm dứt là breach.</w:t>
+        <w:t>Phân loại deposit theo BLDS Điều 328, tiền phong toả/ký quỹ tại tổ chức tín dụng theo Điều 330 và quan hệ penalty–damages phải được legal validation cho mẫu hợp đồng pilot. Hệ thống không tự suy “cọc = phạt” và không coi mọi chấm dứt là breach. [45], [46]</w:t>
       </w:r>
     </w:p>
     <w:p>
@@ -5765,7 +5802,7 @@
         <w:spacing w:before="240" w:after="80"/>
         <w:rPr/>
       </w:pPr>
-      <w:bookmarkStart w:id="16" w:name="__RefHeading___Toc524_AgriContract"/>
+      <w:bookmarkStart w:id="16" w:name="__RefHeading___Toc525_AgriContract"/>
       <w:bookmarkEnd w:id="16"/>
       <w:r>
         <w:rPr>
@@ -5782,7 +5819,7 @@
     <w:p>
       <w:pPr>
         <w:pStyle w:val="Normal"/>
-        <w:spacing w:lineRule="auto" w:line="276" w:before="0" w:after="120"/>
+        <w:spacing w:lineRule="exact" w:line="276" w:before="0" w:after="120"/>
         <w:jc w:val="both"/>
         <w:rPr/>
       </w:pPr>
@@ -5959,7 +5996,7 @@
     <w:p>
       <w:pPr>
         <w:pStyle w:val="Normal"/>
-        <w:spacing w:lineRule="auto" w:line="276" w:before="0" w:after="120"/>
+        <w:spacing w:lineRule="exact" w:line="276" w:before="0" w:after="120"/>
         <w:jc w:val="both"/>
         <w:rPr/>
       </w:pPr>
@@ -6000,7 +6037,7 @@
           <w:sz w:val="21"/>
           <w:szCs w:val="21"/>
         </w:rPr>
-        <w:t>, không phải kiến trúc full Zero Trust. Nếu verifier key holder và các operator liên quan thông đồng, rủi ro vẫn tồn tại.</w:t>
+        <w:t>, không phải mô hình Zero Trust toàn diện. Nếu verifier key holder và các operator liên quan thông đồng, rủi ro vẫn tồn tại.</w:t>
       </w:r>
     </w:p>
     <w:p>
@@ -6012,7 +6049,7 @@
         <w:spacing w:before="320" w:after="120"/>
         <w:rPr/>
       </w:pPr>
-      <w:bookmarkStart w:id="17" w:name="__RefHeading___Toc526_AgriContract"/>
+      <w:bookmarkStart w:id="17" w:name="__RefHeading___Toc527_AgriContract"/>
       <w:bookmarkEnd w:id="17"/>
       <w:r>
         <w:rPr>
@@ -6047,6 +6084,7 @@
       <w:tr>
         <w:trPr>
           <w:tblHeader w:val="true"/>
+          <w:cantSplit w:val="true"/>
         </w:trPr>
         <w:tc>
           <w:tcPr>
@@ -6063,7 +6101,7 @@
           <w:p>
             <w:pPr>
               <w:pStyle w:val="Normal"/>
-              <w:spacing w:lineRule="auto" w:line="252" w:before="0" w:after="0"/>
+              <w:spacing w:lineRule="exact" w:line="252" w:before="0" w:after="0"/>
               <w:jc w:val="start"/>
               <w:rPr/>
             </w:pPr>
@@ -6097,7 +6135,7 @@
           <w:p>
             <w:pPr>
               <w:pStyle w:val="Normal"/>
-              <w:spacing w:lineRule="auto" w:line="252" w:before="0" w:after="0"/>
+              <w:spacing w:lineRule="exact" w:line="252" w:before="0" w:after="0"/>
               <w:jc w:val="start"/>
               <w:rPr/>
             </w:pPr>
@@ -6131,7 +6169,7 @@
           <w:p>
             <w:pPr>
               <w:pStyle w:val="Normal"/>
-              <w:spacing w:lineRule="auto" w:line="252" w:before="0" w:after="0"/>
+              <w:spacing w:lineRule="exact" w:line="252" w:before="0" w:after="0"/>
               <w:jc w:val="start"/>
               <w:rPr/>
             </w:pPr>
@@ -6152,7 +6190,9 @@
         </w:tc>
       </w:tr>
       <w:tr>
-        <w:trPr/>
+        <w:trPr>
+          <w:cantSplit w:val="true"/>
+        </w:trPr>
         <w:tc>
           <w:tcPr>
             <w:tcW w:w="2365" w:type="dxa"/>
@@ -6167,7 +6207,7 @@
           <w:p>
             <w:pPr>
               <w:pStyle w:val="Normal"/>
-              <w:spacing w:lineRule="auto" w:line="252" w:before="0" w:after="0"/>
+              <w:spacing w:lineRule="exact" w:line="252" w:before="0" w:after="0"/>
               <w:jc w:val="start"/>
               <w:rPr/>
             </w:pPr>
@@ -6200,7 +6240,7 @@
           <w:p>
             <w:pPr>
               <w:pStyle w:val="Normal"/>
-              <w:spacing w:lineRule="auto" w:line="252" w:before="0" w:after="0"/>
+              <w:spacing w:lineRule="exact" w:line="252" w:before="0" w:after="0"/>
               <w:jc w:val="start"/>
               <w:rPr/>
             </w:pPr>
@@ -6233,7 +6273,7 @@
           <w:p>
             <w:pPr>
               <w:pStyle w:val="Normal"/>
-              <w:spacing w:lineRule="auto" w:line="252" w:before="0" w:after="0"/>
+              <w:spacing w:lineRule="exact" w:line="252" w:before="0" w:after="0"/>
               <w:jc w:val="start"/>
               <w:rPr/>
             </w:pPr>
@@ -6254,7 +6294,9 @@
         </w:tc>
       </w:tr>
       <w:tr>
-        <w:trPr/>
+        <w:trPr>
+          <w:cantSplit w:val="true"/>
+        </w:trPr>
         <w:tc>
           <w:tcPr>
             <w:tcW w:w="2365" w:type="dxa"/>
@@ -6270,7 +6312,7 @@
           <w:p>
             <w:pPr>
               <w:pStyle w:val="Normal"/>
-              <w:spacing w:lineRule="auto" w:line="252" w:before="0" w:after="0"/>
+              <w:spacing w:lineRule="exact" w:line="252" w:before="0" w:after="0"/>
               <w:jc w:val="start"/>
               <w:rPr/>
             </w:pPr>
@@ -6304,7 +6346,7 @@
           <w:p>
             <w:pPr>
               <w:pStyle w:val="Normal"/>
-              <w:spacing w:lineRule="auto" w:line="252" w:before="0" w:after="0"/>
+              <w:spacing w:lineRule="exact" w:line="252" w:before="0" w:after="0"/>
               <w:jc w:val="start"/>
               <w:rPr/>
             </w:pPr>
@@ -6338,7 +6380,7 @@
           <w:p>
             <w:pPr>
               <w:pStyle w:val="Normal"/>
-              <w:spacing w:lineRule="auto" w:line="252" w:before="0" w:after="0"/>
+              <w:spacing w:lineRule="exact" w:line="252" w:before="0" w:after="0"/>
               <w:jc w:val="start"/>
               <w:rPr/>
             </w:pPr>
@@ -6359,7 +6401,9 @@
         </w:tc>
       </w:tr>
       <w:tr>
-        <w:trPr/>
+        <w:trPr>
+          <w:cantSplit w:val="true"/>
+        </w:trPr>
         <w:tc>
           <w:tcPr>
             <w:tcW w:w="2365" w:type="dxa"/>
@@ -6374,7 +6418,7 @@
           <w:p>
             <w:pPr>
               <w:pStyle w:val="Normal"/>
-              <w:spacing w:lineRule="auto" w:line="252" w:before="0" w:after="0"/>
+              <w:spacing w:lineRule="exact" w:line="252" w:before="0" w:after="0"/>
               <w:jc w:val="start"/>
               <w:rPr/>
             </w:pPr>
@@ -6407,7 +6451,7 @@
           <w:p>
             <w:pPr>
               <w:pStyle w:val="Normal"/>
-              <w:spacing w:lineRule="auto" w:line="252" w:before="0" w:after="0"/>
+              <w:spacing w:lineRule="exact" w:line="252" w:before="0" w:after="0"/>
               <w:jc w:val="start"/>
               <w:rPr/>
             </w:pPr>
@@ -6440,7 +6484,7 @@
           <w:p>
             <w:pPr>
               <w:pStyle w:val="Normal"/>
-              <w:spacing w:lineRule="auto" w:line="252" w:before="0" w:after="0"/>
+              <w:spacing w:lineRule="exact" w:line="252" w:before="0" w:after="0"/>
               <w:jc w:val="start"/>
               <w:rPr/>
             </w:pPr>
@@ -6464,7 +6508,7 @@
     <w:p>
       <w:pPr>
         <w:pStyle w:val="Normal"/>
-        <w:spacing w:lineRule="auto" w:line="276" w:before="0" w:after="120"/>
+        <w:spacing w:lineRule="exact" w:line="276" w:before="0" w:after="120"/>
         <w:jc w:val="both"/>
         <w:rPr/>
       </w:pPr>
@@ -6491,7 +6535,7 @@
         <w:spacing w:before="320" w:after="120"/>
         <w:rPr/>
       </w:pPr>
-      <w:bookmarkStart w:id="18" w:name="__RefHeading___Toc528_AgriContract"/>
+      <w:bookmarkStart w:id="18" w:name="__RefHeading___Toc529_AgriContract"/>
       <w:bookmarkEnd w:id="18"/>
       <w:r>
         <w:rPr>
@@ -6508,7 +6552,7 @@
     <w:p>
       <w:pPr>
         <w:pStyle w:val="Normal"/>
-        <w:spacing w:lineRule="auto" w:line="276" w:before="0" w:after="120"/>
+        <w:spacing w:lineRule="exact" w:line="276" w:before="0" w:after="120"/>
         <w:jc w:val="both"/>
         <w:rPr/>
       </w:pPr>
@@ -6535,7 +6579,7 @@
         <w:spacing w:before="320" w:after="120"/>
         <w:rPr/>
       </w:pPr>
-      <w:bookmarkStart w:id="19" w:name="__RefHeading___Toc530_AgriContract"/>
+      <w:bookmarkStart w:id="19" w:name="__RefHeading___Toc531_AgriContract"/>
       <w:bookmarkEnd w:id="19"/>
       <w:r>
         <w:rPr>
@@ -6552,7 +6596,7 @@
     <w:p>
       <w:pPr>
         <w:pStyle w:val="Normal"/>
-        <w:spacing w:lineRule="auto" w:line="276" w:before="0" w:after="120"/>
+        <w:spacing w:lineRule="exact" w:line="276" w:before="0" w:after="120"/>
         <w:jc w:val="both"/>
         <w:rPr/>
       </w:pPr>
@@ -6579,7 +6623,7 @@
         <w:spacing w:before="320" w:after="120"/>
         <w:rPr/>
       </w:pPr>
-      <w:bookmarkStart w:id="20" w:name="__RefHeading___Toc532_AgriContract"/>
+      <w:bookmarkStart w:id="20" w:name="__RefHeading___Toc533_AgriContract"/>
       <w:bookmarkEnd w:id="20"/>
       <w:r>
         <w:rPr>
@@ -6596,7 +6640,7 @@
     <w:p>
       <w:pPr>
         <w:pStyle w:val="Normal"/>
-        <w:spacing w:lineRule="auto" w:line="276" w:before="0" w:after="120"/>
+        <w:spacing w:lineRule="exact" w:line="276" w:before="0" w:after="120"/>
         <w:jc w:val="both"/>
         <w:rPr/>
       </w:pPr>
@@ -6630,7 +6674,7 @@
     <w:p>
       <w:pPr>
         <w:pStyle w:val="Normal"/>
-        <w:spacing w:lineRule="auto" w:line="276" w:before="0" w:after="120"/>
+        <w:spacing w:lineRule="exact" w:line="276" w:before="0" w:after="120"/>
         <w:jc w:val="both"/>
         <w:rPr/>
       </w:pPr>
@@ -6664,7 +6708,7 @@
     <w:p>
       <w:pPr>
         <w:pStyle w:val="Normal"/>
-        <w:spacing w:lineRule="auto" w:line="276" w:before="0" w:after="120"/>
+        <w:spacing w:lineRule="exact" w:line="276" w:before="0" w:after="120"/>
         <w:jc w:val="both"/>
         <w:rPr/>
       </w:pPr>
@@ -6750,7 +6794,7 @@
     <w:p>
       <w:pPr>
         <w:pStyle w:val="Normal"/>
-        <w:spacing w:lineRule="auto" w:line="276" w:before="0" w:after="120"/>
+        <w:spacing w:lineRule="exact" w:line="276" w:before="0" w:after="120"/>
         <w:jc w:val="both"/>
         <w:rPr/>
       </w:pPr>
@@ -6778,13 +6822,13 @@
           <w:sz w:val="21"/>
           <w:szCs w:val="21"/>
         </w:rPr>
-        <w:t xml:space="preserve"> Không claim blockchain hay full Zero Trust. Thiết kế dùng hash chain/anchor và một số control zero-trust-oriented phù hợp trusted-operator model.</w:t>
+        <w:t xml:space="preserve"> Không claim blockchain hay mô hình Zero Trust toàn diện. Thiết kế dùng hash chain/anchor và một số control zero-trust-oriented phù hợp trusted-operator model.</w:t>
       </w:r>
     </w:p>
     <w:p>
       <w:pPr>
         <w:pStyle w:val="Normal"/>
-        <w:spacing w:lineRule="auto" w:line="276" w:before="0" w:after="120"/>
+        <w:spacing w:lineRule="exact" w:line="276" w:before="0" w:after="120"/>
         <w:jc w:val="both"/>
         <w:rPr/>
       </w:pPr>
@@ -6850,7 +6894,7 @@
         <w:spacing w:before="320" w:after="120"/>
         <w:rPr/>
       </w:pPr>
-      <w:bookmarkStart w:id="21" w:name="__RefHeading___Toc534_AgriContract"/>
+      <w:bookmarkStart w:id="21" w:name="__RefHeading___Toc535_AgriContract"/>
       <w:bookmarkEnd w:id="21"/>
       <w:r>
         <w:rPr>
@@ -6861,199 +6905,132 @@
           <w:sz w:val="30"/>
           <w:szCs w:val="30"/>
         </w:rPr>
-        <w:t>12. Giới hạn và phạm vi ngoài</w:t>
-      </w:r>
-    </w:p>
-    <w:p>
-      <w:pPr>
-        <w:pStyle w:val="ListParagraph"/>
-        <w:numPr>
-          <w:ilvl w:val="0"/>
-          <w:numId w:val="1"/>
-        </w:numPr>
-        <w:spacing w:lineRule="auto" w:line="276" w:before="0" w:after="60"/>
-        <w:rPr/>
-      </w:pPr>
-      <w:r>
-        <w:rPr>
-          <w:rFonts w:eastAsia="Calibri" w:cs="Calibri"/>
-          <w:b w:val="false"/>
-          <w:bCs w:val="false"/>
-          <w:i w:val="false"/>
-          <w:iCs w:val="false"/>
-          <w:color w:val="111827"/>
-          <w:sz w:val="21"/>
-          <w:szCs w:val="21"/>
-        </w:rPr>
-        <w:t>12 business services, API/event/schema và Verification Matrix là thiết kế implementation-ready, chưa phải code/production đã chứng minh.</w:t>
-      </w:r>
-    </w:p>
-    <w:p>
-      <w:pPr>
-        <w:pStyle w:val="ListParagraph"/>
-        <w:numPr>
-          <w:ilvl w:val="0"/>
-          <w:numId w:val="1"/>
-        </w:numPr>
-        <w:spacing w:lineRule="auto" w:line="276" w:before="0" w:after="60"/>
-        <w:rPr/>
-      </w:pPr>
-      <w:r>
-        <w:rPr>
-          <w:rFonts w:eastAsia="Calibri" w:cs="Calibri"/>
-          <w:b w:val="false"/>
-          <w:bCs w:val="false"/>
-          <w:i w:val="false"/>
-          <w:iCs w:val="false"/>
-          <w:color w:val="111827"/>
-          <w:sz w:val="21"/>
-          <w:szCs w:val="21"/>
-        </w:rPr>
-        <w:t>Không tích hợp ngân hàng thật, CA chữ ký số, tổ chức inspection production, đối tác tín dụng hoặc cold rebuild analytics trong Phase 2 hiện tại.</w:t>
-      </w:r>
-    </w:p>
-    <w:p>
-      <w:pPr>
-        <w:pStyle w:val="ListParagraph"/>
-        <w:numPr>
-          <w:ilvl w:val="0"/>
-          <w:numId w:val="1"/>
-        </w:numPr>
-        <w:spacing w:lineRule="auto" w:line="276" w:before="0" w:after="60"/>
-        <w:rPr/>
-      </w:pPr>
-      <w:r>
-        <w:rPr>
-          <w:rFonts w:eastAsia="Calibri" w:cs="Calibri"/>
-          <w:b w:val="false"/>
-          <w:bCs w:val="false"/>
-          <w:i w:val="false"/>
-          <w:iCs w:val="false"/>
-          <w:color w:val="111827"/>
-          <w:sz w:val="21"/>
-          <w:szCs w:val="21"/>
-        </w:rPr>
-        <w:t>Không có full amendment; thay đổi sau ký dùng mutual replacement saga. Mutual termination chỉ cho toàn bộ remaining scope.</w:t>
-      </w:r>
-    </w:p>
-    <w:p>
-      <w:pPr>
-        <w:pStyle w:val="ListParagraph"/>
-        <w:numPr>
-          <w:ilvl w:val="0"/>
-          <w:numId w:val="1"/>
-        </w:numPr>
-        <w:spacing w:lineRule="auto" w:line="276" w:before="0" w:after="60"/>
-        <w:rPr/>
-      </w:pPr>
-      <w:r>
-        <w:rPr>
-          <w:rFonts w:eastAsia="Calibri" w:cs="Calibri"/>
-          <w:b w:val="false"/>
-          <w:bCs w:val="false"/>
-          <w:i w:val="false"/>
-          <w:iCs w:val="false"/>
-          <w:color w:val="111827"/>
-          <w:sz w:val="21"/>
-          <w:szCs w:val="21"/>
-        </w:rPr>
-        <w:t>Không tự xử lý logistics, kế toán, bảo hiểm, due-diligence statement EUDR hay phán quyết pháp lý.</w:t>
-      </w:r>
-    </w:p>
-    <w:p>
-      <w:pPr>
-        <w:pStyle w:val="ListParagraph"/>
-        <w:numPr>
-          <w:ilvl w:val="0"/>
-          <w:numId w:val="1"/>
-        </w:numPr>
-        <w:spacing w:lineRule="auto" w:line="276" w:before="0" w:after="60"/>
-        <w:rPr/>
-      </w:pPr>
-      <w:r>
-        <w:rPr>
-          <w:rFonts w:eastAsia="Calibri" w:cs="Calibri"/>
-          <w:b w:val="false"/>
-          <w:bCs w:val="false"/>
-          <w:i w:val="false"/>
-          <w:iCs w:val="false"/>
-          <w:color w:val="111827"/>
-          <w:sz w:val="21"/>
-          <w:szCs w:val="21"/>
-        </w:rPr>
-        <w:t>Baseline rừng, plot overlap và yield anomaly là signal/review support; không auto kết luận gian lận.</w:t>
-      </w:r>
-    </w:p>
-    <w:p>
-      <w:pPr>
-        <w:pStyle w:val="ListParagraph"/>
-        <w:numPr>
-          <w:ilvl w:val="0"/>
-          <w:numId w:val="1"/>
-        </w:numPr>
-        <w:spacing w:lineRule="auto" w:line="276" w:before="0" w:after="60"/>
-        <w:rPr/>
-      </w:pPr>
-      <w:r>
-        <w:rPr>
-          <w:rFonts w:eastAsia="Calibri" w:cs="Calibri"/>
-          <w:b w:val="false"/>
-          <w:bCs w:val="false"/>
-          <w:i w:val="false"/>
-          <w:iCs w:val="false"/>
-          <w:color w:val="111827"/>
-          <w:sz w:val="21"/>
-          <w:szCs w:val="21"/>
-        </w:rPr>
-        <w:t>Pricing scrape/manual có rủi ro độ trễ/nguồn; không phải indexed settlement engine đã hoàn chỉnh.</w:t>
-      </w:r>
-    </w:p>
-    <w:p>
-      <w:pPr>
-        <w:pStyle w:val="ListParagraph"/>
-        <w:numPr>
-          <w:ilvl w:val="0"/>
-          <w:numId w:val="1"/>
-        </w:numPr>
-        <w:spacing w:lineRule="auto" w:line="276" w:before="0" w:after="60"/>
-        <w:rPr/>
-      </w:pPr>
-      <w:r>
-        <w:rPr>
-          <w:rFonts w:eastAsia="Calibri" w:cs="Calibri"/>
-          <w:b w:val="false"/>
-          <w:bCs w:val="false"/>
-          <w:i w:val="false"/>
-          <w:iCs w:val="false"/>
-          <w:color w:val="111827"/>
-          <w:sz w:val="21"/>
-          <w:szCs w:val="21"/>
-        </w:rPr>
-        <w:t>External verifier emergency lock là control hẹp; không xoá rủi ro thông đồng và không thay DR/segregation of duties.</w:t>
-      </w:r>
-    </w:p>
-    <w:p>
-      <w:pPr>
-        <w:pStyle w:val="ListParagraph"/>
-        <w:numPr>
-          <w:ilvl w:val="0"/>
-          <w:numId w:val="1"/>
-        </w:numPr>
-        <w:spacing w:lineRule="auto" w:line="276" w:before="0" w:after="60"/>
-        <w:rPr/>
-      </w:pPr>
-      <w:r>
-        <w:rPr>
-          <w:rFonts w:eastAsia="Calibri" w:cs="Calibri"/>
-          <w:b w:val="false"/>
-          <w:bCs w:val="false"/>
-          <w:i w:val="false"/>
-          <w:iCs w:val="false"/>
-          <w:color w:val="111827"/>
-          <w:sz w:val="21"/>
-          <w:szCs w:val="21"/>
-        </w:rPr>
-        <w:t>Data retention/cross-border/PII, mẫu contract và legal classification phải được validation trước deployment thật.</w:t>
+        <w:t>12. Current Scope</w:t>
+      </w:r>
+    </w:p>
+    <w:p>
+      <w:pPr>
+        <w:pStyle w:val="Normal"/>
+        <w:spacing w:lineRule="exact" w:line="276" w:before="0" w:after="120"/>
+        <w:jc w:val="both"/>
+        <w:rPr/>
+      </w:pPr>
+      <w:r>
+        <w:rPr>
+          <w:rFonts w:eastAsia="Calibri" w:cs="Calibri"/>
+          <w:b w:val="false"/>
+          <w:bCs w:val="false"/>
+          <w:i w:val="false"/>
+          <w:iCs w:val="false"/>
+          <w:color w:val="111827"/>
+          <w:sz w:val="21"/>
+          <w:szCs w:val="21"/>
+        </w:rPr>
+        <w:t xml:space="preserve">Phase 2 bao phủ contract layer cho giao dịch nông sản B2B: listing/offer, terms và hai chữ ký, buyer/seller deposit, milestone funding, delivery/inspection, attribution/remedy, reputation, audit/evidence, notification, pricing tham chiếu, file intake, governance và các projection analytics liên quan. Luồng canonical phân biệt </w:t>
+      </w:r>
+      <w:r>
+        <w:rPr>
+          <w:rFonts w:eastAsia="Consolas" w:cs="Consolas" w:ascii="Consolas" w:hAnsi="Consolas"/>
+          <w:b w:val="false"/>
+          <w:bCs w:val="false"/>
+          <w:i w:val="false"/>
+          <w:iCs w:val="false"/>
+          <w:color w:val="111827"/>
+          <w:sz w:val="19"/>
+          <w:szCs w:val="19"/>
+        </w:rPr>
+        <w:t>requestedBy</w:t>
+      </w:r>
+      <w:r>
+        <w:rPr>
+          <w:rFonts w:eastAsia="Calibri" w:cs="Calibri"/>
+          <w:b w:val="false"/>
+          <w:bCs w:val="false"/>
+          <w:i w:val="false"/>
+          <w:iCs w:val="false"/>
+          <w:color w:val="111827"/>
+          <w:sz w:val="21"/>
+          <w:szCs w:val="21"/>
+        </w:rPr>
+        <w:t xml:space="preserve">, allegation và </w:t>
+      </w:r>
+      <w:r>
+        <w:rPr>
+          <w:rFonts w:eastAsia="Consolas" w:cs="Consolas" w:ascii="Consolas" w:hAnsi="Consolas"/>
+          <w:b w:val="false"/>
+          <w:bCs w:val="false"/>
+          <w:i w:val="false"/>
+          <w:iCs w:val="false"/>
+          <w:color w:val="111827"/>
+          <w:sz w:val="19"/>
+          <w:szCs w:val="19"/>
+        </w:rPr>
+        <w:t>finalBreachingRole</w:t>
+      </w:r>
+      <w:r>
+        <w:rPr>
+          <w:rFonts w:eastAsia="Calibri" w:cs="Calibri"/>
+          <w:b w:val="false"/>
+          <w:bCs w:val="false"/>
+          <w:i w:val="false"/>
+          <w:iCs w:val="false"/>
+          <w:color w:val="111827"/>
+          <w:sz w:val="21"/>
+          <w:szCs w:val="21"/>
+        </w:rPr>
+        <w:t xml:space="preserve">; hậu quả chế tài (phạt, tịch thu cọc, bồi thường) và uy tín tiêu cực chỉ phản ứng với </w:t>
+      </w:r>
+      <w:r>
+        <w:rPr>
+          <w:rFonts w:eastAsia="Consolas" w:cs="Consolas" w:ascii="Consolas" w:hAnsi="Consolas"/>
+          <w:b w:val="false"/>
+          <w:bCs w:val="false"/>
+          <w:i w:val="false"/>
+          <w:iCs w:val="false"/>
+          <w:color w:val="111827"/>
+          <w:sz w:val="19"/>
+          <w:szCs w:val="19"/>
+        </w:rPr>
+        <w:t>remedy.finalized</w:t>
+      </w:r>
+      <w:r>
+        <w:rPr>
+          <w:rFonts w:eastAsia="Calibri" w:cs="Calibri"/>
+          <w:b w:val="false"/>
+          <w:bCs w:val="false"/>
+          <w:i w:val="false"/>
+          <w:iCs w:val="false"/>
+          <w:color w:val="111827"/>
+          <w:sz w:val="21"/>
+          <w:szCs w:val="21"/>
+        </w:rPr>
+        <w:t xml:space="preserve">, còn thanh toán/hoàn tiền milestone thông thường dùng authority của milestone events; terminal lifecycle yêu cầu expected remedy legs hoàn tất và remaining lock bằng </w:t>
+      </w:r>
+      <w:r>
+        <w:rPr>
+          <w:rFonts w:eastAsia="Consolas" w:cs="Consolas" w:ascii="Consolas" w:hAnsi="Consolas"/>
+          <w:b w:val="false"/>
+          <w:bCs w:val="false"/>
+          <w:i w:val="false"/>
+          <w:iCs w:val="false"/>
+          <w:color w:val="111827"/>
+          <w:sz w:val="19"/>
+          <w:szCs w:val="19"/>
+        </w:rPr>
+        <w:t>0.00</w:t>
+      </w:r>
+      <w:r>
+        <w:rPr>
+          <w:rFonts w:eastAsia="Calibri" w:cs="Calibri"/>
+          <w:b w:val="false"/>
+          <w:bCs w:val="false"/>
+          <w:i w:val="false"/>
+          <w:iCs w:val="false"/>
+          <w:color w:val="111827"/>
+          <w:sz w:val="21"/>
+          <w:szCs w:val="21"/>
+        </w:rPr>
+        <w:t>.</w:t>
       </w:r>
     </w:p>
     <w:p>
@@ -7065,7 +7042,7 @@
         <w:spacing w:before="320" w:after="120"/>
         <w:rPr/>
       </w:pPr>
-      <w:bookmarkStart w:id="22" w:name="__RefHeading___Toc536_AgriContract"/>
+      <w:bookmarkStart w:id="22" w:name="__RefHeading___Toc537_AgriContract"/>
       <w:bookmarkEnd w:id="22"/>
       <w:r>
         <w:rPr>
@@ -7076,27 +7053,7 @@
           <w:sz w:val="30"/>
           <w:szCs w:val="30"/>
         </w:rPr>
-        <w:t>13. Danh mục nguồn tham khảo</w:t>
-      </w:r>
-    </w:p>
-    <w:p>
-      <w:pPr>
-        <w:pStyle w:val="Heading3"/>
-        <w:spacing w:before="180" w:after="60"/>
-        <w:rPr/>
-      </w:pPr>
-      <w:bookmarkStart w:id="23" w:name="__RefHeading___Toc538_AgriContract"/>
-      <w:bookmarkEnd w:id="23"/>
-      <w:r>
-        <w:rPr>
-          <w:rFonts w:eastAsia="Calibri" w:cs="Calibri" w:ascii="Calibri" w:hAnsi="Calibri"/>
-          <w:b/>
-          <w:bCs/>
-          <w:color w:val="374151"/>
-          <w:sz w:val="22"/>
-          <w:szCs w:val="22"/>
-        </w:rPr>
-        <w:t>Văn bản pháp luật</w:t>
+        <w:t>13. Known Limitations</w:t>
       </w:r>
     </w:p>
     <w:p>
@@ -7106,21 +7063,21 @@
           <w:ilvl w:val="0"/>
           <w:numId w:val="1"/>
         </w:numPr>
-        <w:spacing w:lineRule="auto" w:line="276" w:before="0" w:after="60"/>
-        <w:rPr/>
-      </w:pPr>
-      <w:r>
-        <w:rPr>
-          <w:rFonts w:eastAsia="Calibri" w:cs="Calibri"/>
-          <w:b w:val="false"/>
-          <w:bCs w:val="false"/>
-          <w:i w:val="false"/>
-          <w:iCs w:val="false"/>
-          <w:color w:val="111827"/>
-          <w:sz w:val="21"/>
-          <w:szCs w:val="21"/>
-        </w:rPr>
-        <w:t>Luật Giao dịch Điện tử 2023 (Luật 20/2023/QH15, hiệu lực 1/7/2024).</w:t>
+        <w:spacing w:lineRule="exact" w:line="276" w:before="0" w:after="60"/>
+        <w:rPr/>
+      </w:pPr>
+      <w:r>
+        <w:rPr>
+          <w:rFonts w:eastAsia="Calibri" w:cs="Calibri"/>
+          <w:b w:val="false"/>
+          <w:bCs w:val="false"/>
+          <w:i w:val="false"/>
+          <w:iCs w:val="false"/>
+          <w:color w:val="111827"/>
+          <w:sz w:val="21"/>
+          <w:szCs w:val="21"/>
+        </w:rPr>
+        <w:t>12 business services, API/event/schema và Verification Matrix là đặc tả thiết kế định hướng triển khai, chưa phải code/production đã chứng minh.</w:t>
       </w:r>
     </w:p>
     <w:p>
@@ -7130,21 +7087,21 @@
           <w:ilvl w:val="0"/>
           <w:numId w:val="1"/>
         </w:numPr>
-        <w:spacing w:lineRule="auto" w:line="276" w:before="0" w:after="60"/>
-        <w:rPr/>
-      </w:pPr>
-      <w:r>
-        <w:rPr>
-          <w:rFonts w:eastAsia="Calibri" w:cs="Calibri"/>
-          <w:b w:val="false"/>
-          <w:bCs w:val="false"/>
-          <w:i w:val="false"/>
-          <w:iCs w:val="false"/>
-          <w:color w:val="111827"/>
-          <w:sz w:val="21"/>
-          <w:szCs w:val="21"/>
-        </w:rPr>
-        <w:t>Nghị định 52/2024/NĐ-CP — Thanh toán không dùng tiền mặt; Nghị định 52/2013/NĐ-CP — Thương mại điện tử.</w:t>
+        <w:spacing w:lineRule="exact" w:line="276" w:before="0" w:after="60"/>
+        <w:rPr/>
+      </w:pPr>
+      <w:r>
+        <w:rPr>
+          <w:rFonts w:eastAsia="Calibri" w:cs="Calibri"/>
+          <w:b w:val="false"/>
+          <w:bCs w:val="false"/>
+          <w:i w:val="false"/>
+          <w:iCs w:val="false"/>
+          <w:color w:val="111827"/>
+          <w:sz w:val="21"/>
+          <w:szCs w:val="21"/>
+        </w:rPr>
+        <w:t>Không tích hợp ngân hàng thật, CA chữ ký số, tổ chức inspection production, đối tác tín dụng hoặc cold rebuild analytics trong Phase 2 hiện tại.</w:t>
       </w:r>
     </w:p>
     <w:p>
@@ -7154,21 +7111,21 @@
           <w:ilvl w:val="0"/>
           <w:numId w:val="1"/>
         </w:numPr>
-        <w:spacing w:lineRule="auto" w:line="276" w:before="0" w:after="60"/>
-        <w:rPr/>
-      </w:pPr>
-      <w:r>
-        <w:rPr>
-          <w:rFonts w:eastAsia="Calibri" w:cs="Calibri"/>
-          <w:b w:val="false"/>
-          <w:bCs w:val="false"/>
-          <w:i w:val="false"/>
-          <w:iCs w:val="false"/>
-          <w:color w:val="111827"/>
-          <w:sz w:val="21"/>
-          <w:szCs w:val="21"/>
-        </w:rPr>
-        <w:t>Nghị định 98/2018/NĐ-CP — Liên kết sản xuất và tiêu thụ nông sản.</w:t>
+        <w:spacing w:lineRule="exact" w:line="276" w:before="0" w:after="60"/>
+        <w:rPr/>
+      </w:pPr>
+      <w:r>
+        <w:rPr>
+          <w:rFonts w:eastAsia="Calibri" w:cs="Calibri"/>
+          <w:b w:val="false"/>
+          <w:bCs w:val="false"/>
+          <w:i w:val="false"/>
+          <w:iCs w:val="false"/>
+          <w:color w:val="111827"/>
+          <w:sz w:val="21"/>
+          <w:szCs w:val="21"/>
+        </w:rPr>
+        <w:t>Không có full amendment; thay đổi sau ký dùng mutual replacement saga. Mutual termination chỉ cho toàn bộ remaining scope.</w:t>
       </w:r>
     </w:p>
     <w:p>
@@ -7178,21 +7135,21 @@
           <w:ilvl w:val="0"/>
           <w:numId w:val="1"/>
         </w:numPr>
-        <w:spacing w:lineRule="auto" w:line="276" w:before="0" w:after="60"/>
-        <w:rPr/>
-      </w:pPr>
-      <w:r>
-        <w:rPr>
-          <w:rFonts w:eastAsia="Calibri" w:cs="Calibri"/>
-          <w:b w:val="false"/>
-          <w:bCs w:val="false"/>
-          <w:i w:val="false"/>
-          <w:iCs w:val="false"/>
-          <w:color w:val="111827"/>
-          <w:sz w:val="21"/>
-          <w:szCs w:val="21"/>
-        </w:rPr>
-        <w:t>Luật Trọng tài Thương mại 2010 (Luật 54/2010/QH12).</w:t>
+        <w:spacing w:lineRule="exact" w:line="276" w:before="0" w:after="60"/>
+        <w:rPr/>
+      </w:pPr>
+      <w:r>
+        <w:rPr>
+          <w:rFonts w:eastAsia="Calibri" w:cs="Calibri"/>
+          <w:b w:val="false"/>
+          <w:bCs w:val="false"/>
+          <w:i w:val="false"/>
+          <w:iCs w:val="false"/>
+          <w:color w:val="111827"/>
+          <w:sz w:val="21"/>
+          <w:szCs w:val="21"/>
+        </w:rPr>
+        <w:t>Không tự xử lý logistics, kế toán, bảo hiểm, due-diligence statement EUDR hay phán quyết pháp lý.</w:t>
       </w:r>
     </w:p>
     <w:p>
@@ -7202,21 +7159,21 @@
           <w:ilvl w:val="0"/>
           <w:numId w:val="1"/>
         </w:numPr>
-        <w:spacing w:lineRule="auto" w:line="276" w:before="0" w:after="60"/>
-        <w:rPr/>
-      </w:pPr>
-      <w:r>
-        <w:rPr>
-          <w:rFonts w:eastAsia="Calibri" w:cs="Calibri"/>
-          <w:b w:val="false"/>
-          <w:bCs w:val="false"/>
-          <w:i w:val="false"/>
-          <w:iCs w:val="false"/>
-          <w:color w:val="111827"/>
-          <w:sz w:val="21"/>
-          <w:szCs w:val="21"/>
-        </w:rPr>
-        <w:t>Bộ luật Dân sự 2015 — Điều 328, 330, 142, 403, 156, 351.</w:t>
+        <w:spacing w:lineRule="exact" w:line="276" w:before="0" w:after="60"/>
+        <w:rPr/>
+      </w:pPr>
+      <w:r>
+        <w:rPr>
+          <w:rFonts w:eastAsia="Calibri" w:cs="Calibri"/>
+          <w:b w:val="false"/>
+          <w:bCs w:val="false"/>
+          <w:i w:val="false"/>
+          <w:iCs w:val="false"/>
+          <w:color w:val="111827"/>
+          <w:sz w:val="21"/>
+          <w:szCs w:val="21"/>
+        </w:rPr>
+        <w:t>Baseline rừng, plot overlap và yield anomaly là signal/review support; không tự kết luận gian lận hoặc factual truth.</w:t>
       </w:r>
     </w:p>
     <w:p>
@@ -7226,21 +7183,21 @@
           <w:ilvl w:val="0"/>
           <w:numId w:val="1"/>
         </w:numPr>
-        <w:spacing w:lineRule="auto" w:line="276" w:before="0" w:after="60"/>
-        <w:rPr/>
-      </w:pPr>
-      <w:r>
-        <w:rPr>
-          <w:rFonts w:eastAsia="Calibri" w:cs="Calibri"/>
-          <w:b w:val="false"/>
-          <w:bCs w:val="false"/>
-          <w:i w:val="false"/>
-          <w:iCs w:val="false"/>
-          <w:color w:val="111827"/>
-          <w:sz w:val="21"/>
-          <w:szCs w:val="21"/>
-        </w:rPr>
-        <w:t>Luật Thương mại 2005 — Điều 300, 302.</w:t>
+        <w:spacing w:lineRule="exact" w:line="276" w:before="0" w:after="60"/>
+        <w:rPr/>
+      </w:pPr>
+      <w:r>
+        <w:rPr>
+          <w:rFonts w:eastAsia="Calibri" w:cs="Calibri"/>
+          <w:b w:val="false"/>
+          <w:bCs w:val="false"/>
+          <w:i w:val="false"/>
+          <w:iCs w:val="false"/>
+          <w:color w:val="111827"/>
+          <w:sz w:val="21"/>
+          <w:szCs w:val="21"/>
+        </w:rPr>
+        <w:t>Pricing scrape/manual có rủi ro độ trễ/nguồn; không phải indexed settlement engine đã hoàn chỉnh.</w:t>
       </w:r>
     </w:p>
     <w:p>
@@ -7250,41 +7207,21 @@
           <w:ilvl w:val="0"/>
           <w:numId w:val="1"/>
         </w:numPr>
-        <w:spacing w:lineRule="auto" w:line="276" w:before="0" w:after="60"/>
-        <w:rPr/>
-      </w:pPr>
-      <w:r>
-        <w:rPr>
-          <w:rFonts w:eastAsia="Calibri" w:cs="Calibri"/>
-          <w:b w:val="false"/>
-          <w:bCs w:val="false"/>
-          <w:i w:val="false"/>
-          <w:iCs w:val="false"/>
-          <w:color w:val="111827"/>
-          <w:sz w:val="21"/>
-          <w:szCs w:val="21"/>
-        </w:rPr>
-        <w:t>Nghị định 88/2019/NĐ-CP — Xử phạt vi phạm hành chính lĩnh vực tiền tệ.</w:t>
-      </w:r>
-    </w:p>
-    <w:p>
-      <w:pPr>
-        <w:pStyle w:val="Heading3"/>
-        <w:spacing w:before="180" w:after="60"/>
-        <w:rPr/>
-      </w:pPr>
-      <w:bookmarkStart w:id="24" w:name="__RefHeading___Toc540_AgriContract"/>
-      <w:bookmarkEnd w:id="24"/>
-      <w:r>
-        <w:rPr>
-          <w:rFonts w:eastAsia="Calibri" w:cs="Calibri" w:ascii="Calibri" w:hAnsi="Calibri"/>
-          <w:b/>
-          <w:bCs/>
-          <w:color w:val="374151"/>
-          <w:sz w:val="22"/>
-          <w:szCs w:val="22"/>
-        </w:rPr>
-        <w:t>Án lệ &amp; tổ chức pháp lý</w:t>
+        <w:spacing w:lineRule="exact" w:line="276" w:before="0" w:after="60"/>
+        <w:rPr/>
+      </w:pPr>
+      <w:r>
+        <w:rPr>
+          <w:rFonts w:eastAsia="Calibri" w:cs="Calibri"/>
+          <w:b w:val="false"/>
+          <w:bCs w:val="false"/>
+          <w:i w:val="false"/>
+          <w:iCs w:val="false"/>
+          <w:color w:val="111827"/>
+          <w:sz w:val="21"/>
+          <w:szCs w:val="21"/>
+        </w:rPr>
+        <w:t>External verifier emergency lock là control hẹp; không loại bỏ rủi ro thông đồng và không thay DR/separation of duties.</w:t>
       </w:r>
     </w:p>
     <w:p>
@@ -7294,21 +7231,44 @@
           <w:ilvl w:val="0"/>
           <w:numId w:val="1"/>
         </w:numPr>
-        <w:spacing w:lineRule="auto" w:line="276" w:before="0" w:after="60"/>
-        <w:rPr/>
-      </w:pPr>
-      <w:r>
-        <w:rPr>
-          <w:rFonts w:eastAsia="Calibri" w:cs="Calibri"/>
-          <w:b w:val="false"/>
-          <w:bCs w:val="false"/>
-          <w:i w:val="false"/>
-          <w:iCs w:val="false"/>
-          <w:color w:val="111827"/>
-          <w:sz w:val="21"/>
-          <w:szCs w:val="21"/>
-        </w:rPr>
-        <w:t>Bản án 15/2021/KDTM-ST — Toà án quận Nam Từ Liêm, Hà Nội.</w:t>
+        <w:spacing w:lineRule="exact" w:line="276" w:before="0" w:after="60"/>
+        <w:rPr/>
+      </w:pPr>
+      <w:r>
+        <w:rPr>
+          <w:rFonts w:eastAsia="Calibri" w:cs="Calibri"/>
+          <w:b w:val="false"/>
+          <w:bCs w:val="false"/>
+          <w:i w:val="false"/>
+          <w:iCs w:val="false"/>
+          <w:color w:val="111827"/>
+          <w:sz w:val="21"/>
+          <w:szCs w:val="21"/>
+        </w:rPr>
+        <w:t>Data retention/cross-border/PII, mẫu contract và legal classification phải được validation trước deployment thật.</w:t>
+      </w:r>
+    </w:p>
+    <w:p>
+      <w:pPr>
+        <w:pStyle w:val="Heading1"/>
+        <w:pBdr>
+          <w:bottom w:val="single" w:sz="6" w:space="6" w:color="D1D5DB"/>
+        </w:pBdr>
+        <w:spacing w:before="320" w:after="120"/>
+        <w:rPr/>
+      </w:pPr>
+      <w:bookmarkStart w:id="23" w:name="__RefHeading___Toc539_AgriContract"/>
+      <w:bookmarkEnd w:id="23"/>
+      <w:r>
+        <w:rPr>
+          <w:rFonts w:eastAsia="Calibri" w:cs="Calibri" w:ascii="Calibri" w:hAnsi="Calibri"/>
+          <w:b/>
+          <w:bCs/>
+          <w:color w:val="1F2A37"/>
+          <w:sz w:val="30"/>
+          <w:szCs w:val="30"/>
+        </w:rPr>
+        <w:t>14. Future Work</w:t>
       </w:r>
     </w:p>
     <w:p>
@@ -7318,41 +7278,21 @@
           <w:ilvl w:val="0"/>
           <w:numId w:val="1"/>
         </w:numPr>
-        <w:spacing w:lineRule="auto" w:line="276" w:before="0" w:after="60"/>
-        <w:rPr/>
-      </w:pPr>
-      <w:r>
-        <w:rPr>
-          <w:rFonts w:eastAsia="Calibri" w:cs="Calibri"/>
-          <w:b w:val="false"/>
-          <w:bCs w:val="false"/>
-          <w:i w:val="false"/>
-          <w:iCs w:val="false"/>
-          <w:color w:val="111827"/>
-          <w:sz w:val="21"/>
-          <w:szCs w:val="21"/>
-        </w:rPr>
-        <w:t>VIAC — Thống kê tranh chấp 2024 (475 vụ, kỷ lục).</w:t>
-      </w:r>
-    </w:p>
-    <w:p>
-      <w:pPr>
-        <w:pStyle w:val="Heading3"/>
-        <w:spacing w:before="180" w:after="60"/>
-        <w:rPr/>
-      </w:pPr>
-      <w:bookmarkStart w:id="25" w:name="__RefHeading___Toc542_AgriContract"/>
-      <w:bookmarkEnd w:id="25"/>
-      <w:r>
-        <w:rPr>
-          <w:rFonts w:eastAsia="Calibri" w:cs="Calibri" w:ascii="Calibri" w:hAnsi="Calibri"/>
-          <w:b/>
-          <w:bCs/>
-          <w:color w:val="374151"/>
-          <w:sz w:val="22"/>
-          <w:szCs w:val="22"/>
-        </w:rPr>
-        <w:t>Thị trường &amp; nghiên cứu</w:t>
+        <w:spacing w:lineRule="exact" w:line="276" w:before="0" w:after="60"/>
+        <w:rPr/>
+      </w:pPr>
+      <w:r>
+        <w:rPr>
+          <w:rFonts w:eastAsia="Calibri" w:cs="Calibri"/>
+          <w:b w:val="false"/>
+          <w:bCs w:val="false"/>
+          <w:i w:val="false"/>
+          <w:iCs w:val="false"/>
+          <w:color w:val="111827"/>
+          <w:sz w:val="21"/>
+          <w:szCs w:val="21"/>
+        </w:rPr>
+        <w:t>Productionize custodian/ngân hàng, CA/WebAuthn, inspection/accreditation, email/price adapters và OpenTimestamps anchoring.</w:t>
       </w:r>
     </w:p>
     <w:p>
@@ -7362,21 +7302,21 @@
           <w:ilvl w:val="0"/>
           <w:numId w:val="1"/>
         </w:numPr>
-        <w:spacing w:lineRule="auto" w:line="276" w:before="0" w:after="60"/>
-        <w:rPr/>
-      </w:pPr>
-      <w:r>
-        <w:rPr>
-          <w:rFonts w:eastAsia="Calibri" w:cs="Calibri"/>
-          <w:b w:val="false"/>
-          <w:bCs w:val="false"/>
-          <w:i w:val="false"/>
-          <w:iCs w:val="false"/>
-          <w:color w:val="111827"/>
-          <w:sz w:val="21"/>
-          <w:szCs w:val="21"/>
-        </w:rPr>
-        <w:t>VTV.vn — Giá cà phê tăng, làn sóng phá vỡ hợp đồng (17/4/2024).</w:t>
+        <w:spacing w:lineRule="exact" w:line="276" w:before="0" w:after="60"/>
+        <w:rPr/>
+      </w:pPr>
+      <w:r>
+        <w:rPr>
+          <w:rFonts w:eastAsia="Calibri" w:cs="Calibri"/>
+          <w:b w:val="false"/>
+          <w:bCs w:val="false"/>
+          <w:i w:val="false"/>
+          <w:iCs w:val="false"/>
+          <w:color w:val="111827"/>
+          <w:sz w:val="21"/>
+          <w:szCs w:val="21"/>
+        </w:rPr>
+        <w:t>Bổ sung ContractVersion amendment, notice–cure–remedy đầy đủ, quality-indexed settlement và payment/security package mở rộng.</w:t>
       </w:r>
     </w:p>
     <w:p>
@@ -7386,21 +7326,21 @@
           <w:ilvl w:val="0"/>
           <w:numId w:val="1"/>
         </w:numPr>
-        <w:spacing w:lineRule="auto" w:line="276" w:before="0" w:after="60"/>
-        <w:rPr/>
-      </w:pPr>
-      <w:r>
-        <w:rPr>
-          <w:rFonts w:eastAsia="Calibri" w:cs="Calibri"/>
-          <w:b w:val="false"/>
-          <w:bCs w:val="false"/>
-          <w:i w:val="false"/>
-          <w:iCs w:val="false"/>
-          <w:color w:val="111827"/>
-          <w:sz w:val="21"/>
-          <w:szCs w:val="21"/>
-        </w:rPr>
-        <w:t>Báo Pháp Luật TP.HCM — Nghịch lý xuất khẩu cà phê Việt (4/4/2026).</w:t>
+        <w:spacing w:lineRule="exact" w:line="276" w:before="0" w:after="60"/>
+        <w:rPr/>
+      </w:pPr>
+      <w:r>
+        <w:rPr>
+          <w:rFonts w:eastAsia="Calibri" w:cs="Calibri"/>
+          <w:b w:val="false"/>
+          <w:bCs w:val="false"/>
+          <w:i w:val="false"/>
+          <w:iCs w:val="false"/>
+          <w:color w:val="111827"/>
+          <w:sz w:val="21"/>
+          <w:szCs w:val="21"/>
+        </w:rPr>
+        <w:t>Hoàn thiện mTLS/KMS/HSM, separation of duties, deployment attestation, DR/scale và cross-border/ND13 controls.</w:t>
       </w:r>
     </w:p>
     <w:p>
@@ -7410,237 +7350,233 @@
           <w:ilvl w:val="0"/>
           <w:numId w:val="1"/>
         </w:numPr>
-        <w:spacing w:lineRule="auto" w:line="276" w:before="0" w:after="60"/>
-        <w:rPr/>
-      </w:pPr>
-      <w:r>
-        <w:rPr>
-          <w:rFonts w:eastAsia="Calibri" w:cs="Calibri"/>
-          <w:b w:val="false"/>
-          <w:bCs w:val="false"/>
-          <w:i w:val="false"/>
-          <w:iCs w:val="false"/>
-          <w:color w:val="111827"/>
-          <w:sz w:val="21"/>
-          <w:szCs w:val="21"/>
-        </w:rPr>
-        <w:t>Vietnam.vn — Banks partner with the digital agricultural supply chain (1/4/2026).</w:t>
-      </w:r>
-    </w:p>
-    <w:p>
-      <w:pPr>
-        <w:pStyle w:val="ListParagraph"/>
-        <w:numPr>
-          <w:ilvl w:val="0"/>
-          <w:numId w:val="1"/>
-        </w:numPr>
-        <w:spacing w:lineRule="auto" w:line="276" w:before="0" w:after="60"/>
-        <w:rPr/>
-      </w:pPr>
-      <w:r>
-        <w:rPr>
-          <w:rFonts w:eastAsia="Calibri" w:cs="Calibri"/>
-          <w:b w:val="false"/>
-          <w:bCs w:val="false"/>
-          <w:i w:val="false"/>
-          <w:iCs w:val="false"/>
-          <w:color w:val="111827"/>
-          <w:sz w:val="21"/>
-          <w:szCs w:val="21"/>
-        </w:rPr>
-        <w:t>Agribank — Chương trình tín dụng chuỗi giá trị nông nghiệp 2024.</w:t>
-      </w:r>
-    </w:p>
-    <w:p>
-      <w:pPr>
-        <w:pStyle w:val="ListParagraph"/>
-        <w:numPr>
-          <w:ilvl w:val="0"/>
-          <w:numId w:val="1"/>
-        </w:numPr>
-        <w:spacing w:lineRule="auto" w:line="276" w:before="0" w:after="60"/>
-        <w:rPr/>
-      </w:pPr>
-      <w:r>
-        <w:rPr>
-          <w:rFonts w:eastAsia="Calibri" w:cs="Calibri"/>
-          <w:b w:val="false"/>
-          <w:bCs w:val="false"/>
-          <w:i w:val="false"/>
-          <w:iCs w:val="false"/>
-          <w:color w:val="111827"/>
-          <w:sz w:val="21"/>
-          <w:szCs w:val="21"/>
-        </w:rPr>
-        <w:t>VCCI — Báo cáo Kinh tế tư nhân 2025 (75,5% doanh nghiệp cần tài sản thế chấp để tiếp cận tín dụng).</w:t>
-      </w:r>
-    </w:p>
-    <w:p>
-      <w:pPr>
-        <w:pStyle w:val="ListParagraph"/>
-        <w:numPr>
-          <w:ilvl w:val="0"/>
-          <w:numId w:val="1"/>
-        </w:numPr>
-        <w:spacing w:lineRule="auto" w:line="276" w:before="0" w:after="60"/>
-        <w:rPr/>
-      </w:pPr>
-      <w:r>
-        <w:rPr>
-          <w:rFonts w:eastAsia="Calibri" w:cs="Calibri"/>
-          <w:b w:val="false"/>
-          <w:bCs w:val="false"/>
-          <w:i w:val="false"/>
-          <w:iCs w:val="false"/>
-          <w:color w:val="111827"/>
-          <w:sz w:val="21"/>
-          <w:szCs w:val="21"/>
-        </w:rPr>
-        <w:t>EC Regulation (EU) 2025/2650 — EUDR timeline (23/12/2025).</w:t>
-      </w:r>
-    </w:p>
-    <w:p>
-      <w:pPr>
-        <w:pStyle w:val="ListParagraph"/>
-        <w:numPr>
-          <w:ilvl w:val="0"/>
-          <w:numId w:val="1"/>
-        </w:numPr>
-        <w:spacing w:lineRule="auto" w:line="276" w:before="0" w:after="60"/>
-        <w:rPr/>
-      </w:pPr>
-      <w:r>
-        <w:rPr>
-          <w:rFonts w:eastAsia="Calibri" w:cs="Calibri"/>
-          <w:b w:val="false"/>
-          <w:bCs w:val="false"/>
-          <w:i w:val="false"/>
-          <w:iCs w:val="false"/>
-          <w:color w:val="111827"/>
-          <w:sz w:val="21"/>
-          <w:szCs w:val="21"/>
-        </w:rPr>
-        <w:t>European Commission — EUDR Information System; Understand Due Diligence (truy cập 7/2026).</w:t>
-      </w:r>
-    </w:p>
-    <w:p>
-      <w:pPr>
-        <w:pStyle w:val="ListParagraph"/>
-        <w:numPr>
-          <w:ilvl w:val="0"/>
-          <w:numId w:val="1"/>
-        </w:numPr>
-        <w:spacing w:lineRule="auto" w:line="276" w:before="0" w:after="60"/>
-        <w:rPr/>
-      </w:pPr>
-      <w:r>
-        <w:rPr>
-          <w:rFonts w:eastAsia="Calibri" w:cs="Calibri"/>
-          <w:b w:val="false"/>
-          <w:bCs w:val="false"/>
-          <w:i w:val="false"/>
-          <w:iCs w:val="false"/>
-          <w:color w:val="111827"/>
-          <w:sz w:val="21"/>
-          <w:szCs w:val="21"/>
-        </w:rPr>
-        <w:t>Alemu, D., Guinan, A. &amp; Hermanson, J. (2021), DOI 10.1080/09614524.2020.1860194.</w:t>
-      </w:r>
-    </w:p>
-    <w:p>
-      <w:pPr>
-        <w:pStyle w:val="ListParagraph"/>
-        <w:numPr>
-          <w:ilvl w:val="0"/>
-          <w:numId w:val="1"/>
-        </w:numPr>
-        <w:spacing w:lineRule="auto" w:line="276" w:before="0" w:after="60"/>
-        <w:rPr/>
-      </w:pPr>
-      <w:r>
-        <w:rPr>
-          <w:rFonts w:eastAsia="Calibri" w:cs="Calibri"/>
-          <w:b w:val="false"/>
-          <w:bCs w:val="false"/>
-          <w:i w:val="false"/>
-          <w:iCs w:val="false"/>
-          <w:color w:val="111827"/>
-          <w:sz w:val="21"/>
-          <w:szCs w:val="21"/>
-        </w:rPr>
-        <w:t>Macchiavello, R. (2022), DOI 10.1146/annurev-economics-051420-110722.</w:t>
-      </w:r>
-    </w:p>
-    <w:p>
-      <w:pPr>
-        <w:pStyle w:val="ListParagraph"/>
-        <w:numPr>
-          <w:ilvl w:val="0"/>
-          <w:numId w:val="1"/>
-        </w:numPr>
-        <w:spacing w:lineRule="auto" w:line="276" w:before="0" w:after="60"/>
-        <w:rPr/>
-      </w:pPr>
-      <w:r>
-        <w:rPr>
-          <w:rFonts w:eastAsia="Calibri" w:cs="Calibri"/>
-          <w:b w:val="false"/>
-          <w:bCs w:val="false"/>
-          <w:i w:val="false"/>
-          <w:iCs w:val="false"/>
-          <w:color w:val="111827"/>
-          <w:sz w:val="21"/>
-          <w:szCs w:val="21"/>
-        </w:rPr>
-        <w:t>Ewusi Koomson, J. et al. (2022), DOI 10.1080/14728028.2022.2079007.</w:t>
-      </w:r>
-    </w:p>
-    <w:p>
-      <w:pPr>
-        <w:pStyle w:val="ListParagraph"/>
-        <w:numPr>
-          <w:ilvl w:val="0"/>
-          <w:numId w:val="1"/>
-        </w:numPr>
-        <w:spacing w:lineRule="auto" w:line="276" w:before="0" w:after="60"/>
-        <w:rPr/>
-      </w:pPr>
-      <w:r>
-        <w:rPr>
-          <w:rFonts w:eastAsia="Calibri" w:cs="Calibri"/>
-          <w:b w:val="false"/>
-          <w:bCs w:val="false"/>
-          <w:i w:val="false"/>
-          <w:iCs w:val="false"/>
-          <w:color w:val="111827"/>
-          <w:sz w:val="21"/>
-          <w:szCs w:val="21"/>
-        </w:rPr>
-        <w:t>Tefera, D. A. &amp; Bijman, J. (2021), DOI 10.1186/s40100-021-00198-0.</w:t>
-      </w:r>
-    </w:p>
-    <w:p>
-      <w:pPr>
-        <w:pStyle w:val="ListParagraph"/>
-        <w:numPr>
-          <w:ilvl w:val="0"/>
-          <w:numId w:val="1"/>
-        </w:numPr>
-        <w:spacing w:lineRule="auto" w:line="276" w:before="0" w:after="60"/>
-        <w:rPr/>
-      </w:pPr>
-      <w:r>
-        <w:rPr>
-          <w:rFonts w:eastAsia="Calibri" w:cs="Calibri"/>
-          <w:b w:val="false"/>
-          <w:bCs w:val="false"/>
-          <w:i w:val="false"/>
-          <w:iCs w:val="false"/>
-          <w:color w:val="111827"/>
-          <w:sz w:val="21"/>
-          <w:szCs w:val="21"/>
-        </w:rPr>
-        <w:t>Abreham, G. et al. (2025), DOI 10.1080/23311932.2025.2551263.</w:t>
+        <w:spacing w:lineRule="exact" w:line="276" w:before="0" w:after="60"/>
+        <w:rPr/>
+      </w:pPr>
+      <w:r>
+        <w:rPr>
+          <w:rFonts w:eastAsia="Calibri" w:cs="Calibri"/>
+          <w:b w:val="false"/>
+          <w:bCs w:val="false"/>
+          <w:i w:val="false"/>
+          <w:iCs w:val="false"/>
+          <w:color w:val="111827"/>
+          <w:sz w:val="21"/>
+          <w:szCs w:val="21"/>
+        </w:rPr>
+        <w:t>Tự động hoá giá cao su quốc tế sau khi chốt chuẩn hoá đơn vị/tỷ giá; tích hợp logistics/3PL khi có đối tác thật.</w:t>
+      </w:r>
+    </w:p>
+    <w:p>
+      <w:pPr>
+        <w:pStyle w:val="Heading1"/>
+        <w:pBdr>
+          <w:bottom w:val="single" w:sz="6" w:space="6" w:color="D1D5DB"/>
+        </w:pBdr>
+        <w:spacing w:before="320" w:after="120"/>
+        <w:rPr/>
+      </w:pPr>
+      <w:bookmarkStart w:id="24" w:name="__RefHeading___Toc541_AgriContract"/>
+      <w:bookmarkEnd w:id="24"/>
+      <w:r>
+        <w:rPr>
+          <w:rFonts w:eastAsia="Calibri" w:cs="Calibri" w:ascii="Calibri" w:hAnsi="Calibri"/>
+          <w:b/>
+          <w:bCs/>
+          <w:color w:val="1F2A37"/>
+          <w:sz w:val="30"/>
+          <w:szCs w:val="30"/>
+        </w:rPr>
+        <w:t>15. Danh mục nguồn tham khảo</w:t>
+      </w:r>
+    </w:p>
+    <w:p>
+      <w:pPr>
+        <w:pStyle w:val="Normal"/>
+        <w:spacing w:lineRule="exact" w:line="276" w:before="0" w:after="120"/>
+        <w:jc w:val="both"/>
+        <w:rPr/>
+      </w:pPr>
+      <w:r>
+        <w:rPr>
+          <w:rFonts w:eastAsia="Calibri" w:cs="Calibri"/>
+          <w:b w:val="false"/>
+          <w:bCs w:val="false"/>
+          <w:i w:val="false"/>
+          <w:iCs w:val="false"/>
+          <w:color w:val="111827"/>
+          <w:sz w:val="21"/>
+          <w:szCs w:val="21"/>
+        </w:rPr>
+        <w:t>[15] T. T. Nguyen et al., “Female leadership, internet use, and performance of agricultural cooperatives in Vietnam,” Ann. Public Cooperative Econ., vol. 94, no. 3, 2023, doi: 10.1111/apce.12434.</w:t>
+      </w:r>
+    </w:p>
+    <w:p>
+      <w:pPr>
+        <w:pStyle w:val="Normal"/>
+        <w:spacing w:lineRule="exact" w:line="276" w:before="0" w:after="120"/>
+        <w:jc w:val="both"/>
+        <w:rPr/>
+      </w:pPr>
+      <w:r>
+        <w:rPr>
+          <w:rFonts w:eastAsia="Calibri" w:cs="Calibri"/>
+          <w:b w:val="false"/>
+          <w:bCs w:val="false"/>
+          <w:i w:val="false"/>
+          <w:iCs w:val="false"/>
+          <w:color w:val="111827"/>
+          <w:sz w:val="21"/>
+          <w:szCs w:val="21"/>
+        </w:rPr>
+        <w:t>[16] A. T. Duong, “Unveiling the role of government support: Empirical studies on the performance of cooperatives in Vietnam,” Ann. Public Cooperative Econ., vol. 96, no. 3, 2025, doi: 10.1111/apce.70001.</w:t>
+      </w:r>
+    </w:p>
+    <w:p>
+      <w:pPr>
+        <w:pStyle w:val="Normal"/>
+        <w:spacing w:lineRule="exact" w:line="276" w:before="0" w:after="120"/>
+        <w:jc w:val="both"/>
+        <w:rPr/>
+      </w:pPr>
+      <w:r>
+        <w:rPr>
+          <w:rFonts w:eastAsia="Calibri" w:cs="Calibri"/>
+          <w:b w:val="false"/>
+          <w:bCs w:val="false"/>
+          <w:i w:val="false"/>
+          <w:iCs w:val="false"/>
+          <w:color w:val="111827"/>
+          <w:sz w:val="21"/>
+          <w:szCs w:val="21"/>
+        </w:rPr>
+        <w:t>[18] G. Burtch, Y. Hong, and S. Kumar, “When Does Dispute Resolution Substitute for a Reputation System?,” Prod. Oper. Manag., vol. 30, no. 6, 2020, doi: 10.1111/poms.13341.</w:t>
+      </w:r>
+    </w:p>
+    <w:p>
+      <w:pPr>
+        <w:pStyle w:val="Normal"/>
+        <w:spacing w:lineRule="exact" w:line="276" w:before="0" w:after="120"/>
+        <w:jc w:val="both"/>
+        <w:rPr/>
+      </w:pPr>
+      <w:r>
+        <w:rPr>
+          <w:rFonts w:eastAsia="Calibri" w:cs="Calibri"/>
+          <w:b w:val="false"/>
+          <w:bCs w:val="false"/>
+          <w:i w:val="false"/>
+          <w:iCs w:val="false"/>
+          <w:color w:val="111827"/>
+          <w:sz w:val="21"/>
+          <w:szCs w:val="21"/>
+        </w:rPr>
+        <w:t>[20] J. R. Wolf and W. A. Muhanna, “Feedback Mechanisms, Judgment Bias, and Trust Formation in Online Auctions,” Decision Sciences, vol. 42, no. 1, 2011, doi: 10.1111/j.1540-5915.2010.00301.x.</w:t>
+      </w:r>
+    </w:p>
+    <w:p>
+      <w:pPr>
+        <w:pStyle w:val="Normal"/>
+        <w:spacing w:lineRule="exact" w:line="276" w:before="0" w:after="120"/>
+        <w:jc w:val="both"/>
+        <w:rPr/>
+      </w:pPr>
+      <w:r>
+        <w:rPr>
+          <w:rFonts w:eastAsia="Calibri" w:cs="Calibri"/>
+          <w:b w:val="false"/>
+          <w:bCs w:val="false"/>
+          <w:i w:val="false"/>
+          <w:iCs w:val="false"/>
+          <w:color w:val="111827"/>
+          <w:sz w:val="21"/>
+          <w:szCs w:val="21"/>
+        </w:rPr>
+        <w:t>[27] Quốc hội Việt Nam, Luật Giao dịch điện tử số 20/2023/QH15, 2023.</w:t>
+      </w:r>
+    </w:p>
+    <w:p>
+      <w:pPr>
+        <w:pStyle w:val="Normal"/>
+        <w:spacing w:lineRule="exact" w:line="276" w:before="0" w:after="120"/>
+        <w:jc w:val="both"/>
+        <w:rPr/>
+      </w:pPr>
+      <w:r>
+        <w:rPr>
+          <w:rFonts w:eastAsia="Calibri" w:cs="Calibri"/>
+          <w:b w:val="false"/>
+          <w:bCs w:val="false"/>
+          <w:i w:val="false"/>
+          <w:iCs w:val="false"/>
+          <w:color w:val="111827"/>
+          <w:sz w:val="21"/>
+          <w:szCs w:val="21"/>
+        </w:rPr>
+        <w:t>[28] Chính phủ Việt Nam, Nghị định 52/2024/NĐ-CP, 2024.</w:t>
+      </w:r>
+    </w:p>
+    <w:p>
+      <w:pPr>
+        <w:pStyle w:val="Normal"/>
+        <w:spacing w:lineRule="exact" w:line="276" w:before="0" w:after="120"/>
+        <w:jc w:val="both"/>
+        <w:rPr/>
+      </w:pPr>
+      <w:r>
+        <w:rPr>
+          <w:rFonts w:eastAsia="Calibri" w:cs="Calibri"/>
+          <w:b w:val="false"/>
+          <w:bCs w:val="false"/>
+          <w:i w:val="false"/>
+          <w:iCs w:val="false"/>
+          <w:color w:val="111827"/>
+          <w:sz w:val="21"/>
+          <w:szCs w:val="21"/>
+        </w:rPr>
+        <w:t>[29] Chính phủ Việt Nam, Nghị định 340/2025/NĐ-CP, 2025.</w:t>
+      </w:r>
+    </w:p>
+    <w:p>
+      <w:pPr>
+        <w:pStyle w:val="Normal"/>
+        <w:spacing w:lineRule="exact" w:line="276" w:before="0" w:after="120"/>
+        <w:jc w:val="both"/>
+        <w:rPr/>
+      </w:pPr>
+      <w:r>
+        <w:rPr>
+          <w:rFonts w:eastAsia="Calibri" w:cs="Calibri"/>
+          <w:b w:val="false"/>
+          <w:bCs w:val="false"/>
+          <w:i w:val="false"/>
+          <w:iCs w:val="false"/>
+          <w:color w:val="111827"/>
+          <w:sz w:val="21"/>
+          <w:szCs w:val="21"/>
+        </w:rPr>
+        <w:t>[45] Quốc hội Việt Nam, Bộ luật Dân sự số 91/2015/QH13, 2015.</w:t>
+      </w:r>
+    </w:p>
+    <w:p>
+      <w:pPr>
+        <w:pStyle w:val="Normal"/>
+        <w:spacing w:lineRule="exact" w:line="276" w:before="0" w:after="120"/>
+        <w:jc w:val="both"/>
+        <w:rPr/>
+      </w:pPr>
+      <w:r>
+        <w:rPr>
+          <w:rFonts w:eastAsia="Calibri" w:cs="Calibri"/>
+          <w:b w:val="false"/>
+          <w:bCs w:val="false"/>
+          <w:i w:val="false"/>
+          <w:iCs w:val="false"/>
+          <w:color w:val="111827"/>
+          <w:sz w:val="21"/>
+          <w:szCs w:val="21"/>
+        </w:rPr>
+        <w:t>[46] Quốc hội Việt Nam, Luật Thương mại số 36/2005/QH11, 2005.</w:t>
       </w:r>
     </w:p>
     <w:p>
@@ -7695,7 +7631,7 @@
 </file>
 
 <file path=word/footer1.xml><?xml version="1.0" encoding="utf-8"?>
-<w:ftr xmlns:o="urn:schemas-microsoft-com:office:office" xmlns:r="http://schemas.openxmlformats.org/officeDocument/2006/relationships" xmlns:v="urn:schemas-microsoft-com:vml" xmlns:w="http://schemas.openxmlformats.org/wordprocessingml/2006/main" xmlns:w10="urn:schemas-microsoft-com:office:word" xmlns:wp="http://schemas.openxmlformats.org/drawingml/2006/wordprocessingDrawing" xmlns:pic="http://schemas.openxmlformats.org/drawingml/2006/picture" xmlns:wps="http://schemas.microsoft.com/office/word/2010/wordprocessingShape" xmlns:wpg="http://schemas.microsoft.com/office/word/2010/wordprocessingGroup" xmlns:mc="http://schemas.openxmlformats.org/markup-compatibility/2006" xmlns:wp14="http://schemas.microsoft.com/office/word/2010/wordprocessingDrawing" xmlns:w14="http://schemas.microsoft.com/office/word/2010/wordml" xmlns:w15="http://schemas.microsoft.com/office/word/2012/wordml" mc:Ignorable="w14 wp14 w15">
+<w:ftr xmlns:o="urn:schemas-microsoft-com:office:office" xmlns:r="http://schemas.openxmlformats.org/officeDocument/2006/relationships" xmlns:v="urn:schemas-microsoft-com:vml" xmlns:w="http://schemas.openxmlformats.org/wordprocessingml/2006/main" xmlns:w10="urn:schemas-microsoft-com:office:word" xmlns:wp="http://schemas.openxmlformats.org/drawingml/2006/wordprocessingDrawing" xmlns:wps="http://schemas.microsoft.com/office/word/2010/wordprocessingShape" xmlns:wpg="http://schemas.microsoft.com/office/word/2010/wordprocessingGroup" xmlns:mc="http://schemas.openxmlformats.org/markup-compatibility/2006" xmlns:wp14="http://schemas.microsoft.com/office/word/2010/wordprocessingDrawing" xmlns:w14="http://schemas.microsoft.com/office/word/2010/wordml" xmlns:w15="http://schemas.microsoft.com/office/word/2012/wordml" mc:Ignorable="w14 wp14 w15">
   <w:p>
     <w:pPr>
       <w:pStyle w:val="Footer"/>
@@ -7709,7 +7645,7 @@
 </file>
 
 <file path=word/footer2.xml><?xml version="1.0" encoding="utf-8"?>
-<w:ftr xmlns:o="urn:schemas-microsoft-com:office:office" xmlns:r="http://schemas.openxmlformats.org/officeDocument/2006/relationships" xmlns:v="urn:schemas-microsoft-com:vml" xmlns:w="http://schemas.openxmlformats.org/wordprocessingml/2006/main" xmlns:w10="urn:schemas-microsoft-com:office:word" xmlns:wp="http://schemas.openxmlformats.org/drawingml/2006/wordprocessingDrawing" xmlns:pic="http://schemas.openxmlformats.org/drawingml/2006/picture" xmlns:wps="http://schemas.microsoft.com/office/word/2010/wordprocessingShape" xmlns:wpg="http://schemas.microsoft.com/office/word/2010/wordprocessingGroup" xmlns:mc="http://schemas.openxmlformats.org/markup-compatibility/2006" xmlns:wp14="http://schemas.microsoft.com/office/word/2010/wordprocessingDrawing" xmlns:w14="http://schemas.microsoft.com/office/word/2010/wordml" xmlns:w15="http://schemas.microsoft.com/office/word/2012/wordml" mc:Ignorable="w14 wp14 w15">
+<w:ftr xmlns:o="urn:schemas-microsoft-com:office:office" xmlns:r="http://schemas.openxmlformats.org/officeDocument/2006/relationships" xmlns:v="urn:schemas-microsoft-com:vml" xmlns:w="http://schemas.openxmlformats.org/wordprocessingml/2006/main" xmlns:w10="urn:schemas-microsoft-com:office:word" xmlns:wp="http://schemas.openxmlformats.org/drawingml/2006/wordprocessingDrawing" xmlns:wps="http://schemas.microsoft.com/office/word/2010/wordprocessingShape" xmlns:wpg="http://schemas.microsoft.com/office/word/2010/wordprocessingGroup" xmlns:mc="http://schemas.openxmlformats.org/markup-compatibility/2006" xmlns:wp14="http://schemas.microsoft.com/office/word/2010/wordprocessingDrawing" xmlns:w14="http://schemas.microsoft.com/office/word/2010/wordml" xmlns:w15="http://schemas.microsoft.com/office/word/2012/wordml" mc:Ignorable="w14 wp14 w15">
   <w:p>
     <w:pPr>
       <w:pStyle w:val="Normal"/>
@@ -7780,7 +7716,7 @@
 </file>
 
 <file path=word/footer3.xml><?xml version="1.0" encoding="utf-8"?>
-<w:ftr xmlns:o="urn:schemas-microsoft-com:office:office" xmlns:r="http://schemas.openxmlformats.org/officeDocument/2006/relationships" xmlns:v="urn:schemas-microsoft-com:vml" xmlns:w="http://schemas.openxmlformats.org/wordprocessingml/2006/main" xmlns:w10="urn:schemas-microsoft-com:office:word" xmlns:wp="http://schemas.openxmlformats.org/drawingml/2006/wordprocessingDrawing" xmlns:pic="http://schemas.openxmlformats.org/drawingml/2006/picture" xmlns:wps="http://schemas.microsoft.com/office/word/2010/wordprocessingShape" xmlns:wpg="http://schemas.microsoft.com/office/word/2010/wordprocessingGroup" xmlns:mc="http://schemas.openxmlformats.org/markup-compatibility/2006" xmlns:wp14="http://schemas.microsoft.com/office/word/2010/wordprocessingDrawing" xmlns:w14="http://schemas.microsoft.com/office/word/2010/wordml" xmlns:w15="http://schemas.microsoft.com/office/word/2012/wordml" mc:Ignorable="w14 wp14 w15">
+<w:ftr xmlns:o="urn:schemas-microsoft-com:office:office" xmlns:r="http://schemas.openxmlformats.org/officeDocument/2006/relationships" xmlns:v="urn:schemas-microsoft-com:vml" xmlns:w="http://schemas.openxmlformats.org/wordprocessingml/2006/main" xmlns:w10="urn:schemas-microsoft-com:office:word" xmlns:wp="http://schemas.openxmlformats.org/drawingml/2006/wordprocessingDrawing" xmlns:wps="http://schemas.microsoft.com/office/word/2010/wordprocessingShape" xmlns:wpg="http://schemas.microsoft.com/office/word/2010/wordprocessingGroup" xmlns:mc="http://schemas.openxmlformats.org/markup-compatibility/2006" xmlns:wp14="http://schemas.microsoft.com/office/word/2010/wordprocessingDrawing" xmlns:w14="http://schemas.microsoft.com/office/word/2010/wordml" xmlns:w15="http://schemas.microsoft.com/office/word/2012/wordml" mc:Ignorable="w14 wp14 w15">
   <w:p>
     <w:pPr>
       <w:pStyle w:val="Normal"/>
@@ -7851,7 +7787,7 @@
 </file>
 
 <file path=word/header1.xml><?xml version="1.0" encoding="utf-8"?>
-<w:hdr xmlns:o="urn:schemas-microsoft-com:office:office" xmlns:r="http://schemas.openxmlformats.org/officeDocument/2006/relationships" xmlns:v="urn:schemas-microsoft-com:vml" xmlns:w="http://schemas.openxmlformats.org/wordprocessingml/2006/main" xmlns:w10="urn:schemas-microsoft-com:office:word" xmlns:wp="http://schemas.openxmlformats.org/drawingml/2006/wordprocessingDrawing" xmlns:pic="http://schemas.openxmlformats.org/drawingml/2006/picture" xmlns:wps="http://schemas.microsoft.com/office/word/2010/wordprocessingShape" xmlns:wpg="http://schemas.microsoft.com/office/word/2010/wordprocessingGroup" xmlns:mc="http://schemas.openxmlformats.org/markup-compatibility/2006" xmlns:wp14="http://schemas.microsoft.com/office/word/2010/wordprocessingDrawing" xmlns:w14="http://schemas.microsoft.com/office/word/2010/wordml" xmlns:w15="http://schemas.microsoft.com/office/word/2012/wordml" mc:Ignorable="w14 wp14 w15">
+<w:hdr xmlns:o="urn:schemas-microsoft-com:office:office" xmlns:r="http://schemas.openxmlformats.org/officeDocument/2006/relationships" xmlns:v="urn:schemas-microsoft-com:vml" xmlns:w="http://schemas.openxmlformats.org/wordprocessingml/2006/main" xmlns:w10="urn:schemas-microsoft-com:office:word" xmlns:wp="http://schemas.openxmlformats.org/drawingml/2006/wordprocessingDrawing" xmlns:wps="http://schemas.microsoft.com/office/word/2010/wordprocessingShape" xmlns:wpg="http://schemas.microsoft.com/office/word/2010/wordprocessingGroup" xmlns:mc="http://schemas.openxmlformats.org/markup-compatibility/2006" xmlns:wp14="http://schemas.microsoft.com/office/word/2010/wordprocessingDrawing" xmlns:w14="http://schemas.microsoft.com/office/word/2010/wordml" xmlns:w15="http://schemas.microsoft.com/office/word/2012/wordml" mc:Ignorable="w14 wp14 w15">
   <w:p>
     <w:pPr>
       <w:pStyle w:val="Header"/>
@@ -7865,7 +7801,7 @@
 </file>
 
 <file path=word/header2.xml><?xml version="1.0" encoding="utf-8"?>
-<w:hdr xmlns:o="urn:schemas-microsoft-com:office:office" xmlns:r="http://schemas.openxmlformats.org/officeDocument/2006/relationships" xmlns:v="urn:schemas-microsoft-com:vml" xmlns:w="http://schemas.openxmlformats.org/wordprocessingml/2006/main" xmlns:w10="urn:schemas-microsoft-com:office:word" xmlns:wp="http://schemas.openxmlformats.org/drawingml/2006/wordprocessingDrawing" xmlns:pic="http://schemas.openxmlformats.org/drawingml/2006/picture" xmlns:wps="http://schemas.microsoft.com/office/word/2010/wordprocessingShape" xmlns:wpg="http://schemas.microsoft.com/office/word/2010/wordprocessingGroup" xmlns:mc="http://schemas.openxmlformats.org/markup-compatibility/2006" xmlns:wp14="http://schemas.microsoft.com/office/word/2010/wordprocessingDrawing" xmlns:w14="http://schemas.microsoft.com/office/word/2010/wordml" xmlns:w15="http://schemas.microsoft.com/office/word/2012/wordml" mc:Ignorable="w14 wp14 w15">
+<w:hdr xmlns:o="urn:schemas-microsoft-com:office:office" xmlns:r="http://schemas.openxmlformats.org/officeDocument/2006/relationships" xmlns:v="urn:schemas-microsoft-com:vml" xmlns:w="http://schemas.openxmlformats.org/wordprocessingml/2006/main" xmlns:w10="urn:schemas-microsoft-com:office:word" xmlns:wp="http://schemas.openxmlformats.org/drawingml/2006/wordprocessingDrawing" xmlns:wps="http://schemas.microsoft.com/office/word/2010/wordprocessingShape" xmlns:wpg="http://schemas.microsoft.com/office/word/2010/wordprocessingGroup" xmlns:mc="http://schemas.openxmlformats.org/markup-compatibility/2006" xmlns:wp14="http://schemas.microsoft.com/office/word/2010/wordprocessingDrawing" xmlns:w14="http://schemas.microsoft.com/office/word/2010/wordml" xmlns:w15="http://schemas.microsoft.com/office/word/2012/wordml" mc:Ignorable="w14 wp14 w15">
   <w:p>
     <w:pPr>
       <w:pStyle w:val="Normal"/>
@@ -7887,7 +7823,7 @@
 </file>
 
 <file path=word/header3.xml><?xml version="1.0" encoding="utf-8"?>
-<w:hdr xmlns:o="urn:schemas-microsoft-com:office:office" xmlns:r="http://schemas.openxmlformats.org/officeDocument/2006/relationships" xmlns:v="urn:schemas-microsoft-com:vml" xmlns:w="http://schemas.openxmlformats.org/wordprocessingml/2006/main" xmlns:w10="urn:schemas-microsoft-com:office:word" xmlns:wp="http://schemas.openxmlformats.org/drawingml/2006/wordprocessingDrawing" xmlns:pic="http://schemas.openxmlformats.org/drawingml/2006/picture" xmlns:wps="http://schemas.microsoft.com/office/word/2010/wordprocessingShape" xmlns:wpg="http://schemas.microsoft.com/office/word/2010/wordprocessingGroup" xmlns:mc="http://schemas.openxmlformats.org/markup-compatibility/2006" xmlns:wp14="http://schemas.microsoft.com/office/word/2010/wordprocessingDrawing" xmlns:w14="http://schemas.microsoft.com/office/word/2010/wordml" xmlns:w15="http://schemas.microsoft.com/office/word/2012/wordml" mc:Ignorable="w14 wp14 w15">
+<w:hdr xmlns:o="urn:schemas-microsoft-com:office:office" xmlns:r="http://schemas.openxmlformats.org/officeDocument/2006/relationships" xmlns:v="urn:schemas-microsoft-com:vml" xmlns:w="http://schemas.openxmlformats.org/wordprocessingml/2006/main" xmlns:w10="urn:schemas-microsoft-com:office:word" xmlns:wp="http://schemas.openxmlformats.org/drawingml/2006/wordprocessingDrawing" xmlns:wps="http://schemas.microsoft.com/office/word/2010/wordprocessingShape" xmlns:wpg="http://schemas.microsoft.com/office/word/2010/wordprocessingGroup" xmlns:mc="http://schemas.openxmlformats.org/markup-compatibility/2006" xmlns:wp14="http://schemas.microsoft.com/office/word/2010/wordprocessingDrawing" xmlns:w14="http://schemas.microsoft.com/office/word/2010/wordml" xmlns:w15="http://schemas.microsoft.com/office/word/2012/wordml" mc:Ignorable="w14 wp14 w15">
   <w:p>
     <w:pPr>
       <w:pStyle w:val="Normal"/>
@@ -8195,7 +8131,7 @@
     </w:rPr>
   </w:style>
   <w:style w:type="paragraph" w:styleId="Heading1">
-    <w:name w:val="heading 1"/>
+    <w:name w:val="Heading 1"/>
     <w:basedOn w:val="Heading"/>
     <w:qFormat/>
     <w:pPr>
@@ -8211,7 +8147,7 @@
     </w:rPr>
   </w:style>
   <w:style w:type="paragraph" w:styleId="Heading2">
-    <w:name w:val="heading 2"/>
+    <w:name w:val="Heading 2"/>
     <w:basedOn w:val="Heading"/>
     <w:qFormat/>
     <w:pPr>
@@ -8227,7 +8163,7 @@
     </w:rPr>
   </w:style>
   <w:style w:type="paragraph" w:styleId="Heading3">
-    <w:name w:val="heading 3"/>
+    <w:name w:val="Heading 3"/>
     <w:basedOn w:val="Heading"/>
     <w:qFormat/>
     <w:pPr>
@@ -8243,7 +8179,7 @@
     </w:rPr>
   </w:style>
   <w:style w:type="paragraph" w:styleId="Heading4">
-    <w:name w:val="heading 4"/>
+    <w:name w:val="Heading 4"/>
     <w:basedOn w:val="Heading"/>
     <w:qFormat/>
     <w:pPr>
@@ -8259,7 +8195,7 @@
     </w:rPr>
   </w:style>
   <w:style w:type="paragraph" w:styleId="Heading5">
-    <w:name w:val="heading 5"/>
+    <w:name w:val="Heading 5"/>
     <w:basedOn w:val="Heading"/>
     <w:qFormat/>
     <w:pPr/>
@@ -8268,7 +8204,7 @@
     </w:rPr>
   </w:style>
   <w:style w:type="paragraph" w:styleId="Heading6">
-    <w:name w:val="heading 6"/>
+    <w:name w:val="Heading 6"/>
     <w:basedOn w:val="Heading"/>
     <w:qFormat/>
     <w:pPr/>
@@ -8296,7 +8232,7 @@
     </w:rPr>
   </w:style>
   <w:style w:type="character" w:styleId="FootnoteReference">
-    <w:name w:val="footnote reference"/>
+    <w:name w:val="Footnote Reference"/>
     <w:rPr>
       <w:vertAlign w:val="superscript"/>
     </w:rPr>
@@ -8324,7 +8260,7 @@
     </w:rPr>
   </w:style>
   <w:style w:type="character" w:styleId="EndnoteReference">
-    <w:name w:val="endnote reference"/>
+    <w:name w:val="Endnote Reference"/>
     <w:rPr>
       <w:vertAlign w:val="superscript"/>
     </w:rPr>
@@ -8356,7 +8292,7 @@
       <w:spacing w:before="240" w:after="120"/>
     </w:pPr>
     <w:rPr>
-      <w:rFonts w:ascii="Liberation Sans" w:hAnsi="Liberation Sans" w:eastAsia="Noto Sans CJK SC" w:cs="Lohit Devanagari"/>
+      <w:rFonts w:ascii="Liberation Sans" w:hAnsi="Liberation Sans" w:eastAsia="Noto Sans CJK SC" w:cs="FreeSans"/>
       <w:sz w:val="28"/>
       <w:szCs w:val="28"/>
     </w:rPr>
@@ -8374,11 +8310,11 @@
     <w:basedOn w:val="BodyText"/>
     <w:pPr/>
     <w:rPr>
-      <w:rFonts w:cs="Lohit Devanagari"/>
+      <w:rFonts w:cs="FreeSans"/>
     </w:rPr>
   </w:style>
   <w:style w:type="paragraph" w:styleId="Caption">
-    <w:name w:val="caption"/>
+    <w:name w:val="Caption"/>
     <w:basedOn w:val="Normal"/>
     <w:qFormat/>
     <w:pPr>
@@ -8386,7 +8322,7 @@
       <w:spacing w:before="120" w:after="120"/>
     </w:pPr>
     <w:rPr>
-      <w:rFonts w:cs="Lohit Devanagari"/>
+      <w:rFonts w:cs="FreeSans"/>
       <w:i/>
       <w:iCs/>
       <w:sz w:val="24"/>
@@ -8401,7 +8337,7 @@
       <w:suppressLineNumbers/>
     </w:pPr>
     <w:rPr>
-      <w:rFonts w:cs="Lohit Devanagari"/>
+      <w:rFonts w:cs="FreeSans"/>
     </w:rPr>
   </w:style>
   <w:style w:type="paragraph" w:styleId="Title">
@@ -8453,7 +8389,7 @@
     </w:rPr>
   </w:style>
   <w:style w:type="paragraph" w:styleId="FootnoteText">
-    <w:name w:val="footnote text"/>
+    <w:name w:val="Footnote Text"/>
     <w:basedOn w:val="Normal"/>
     <w:link w:val="FootnoteTextChar"/>
     <w:uiPriority w:val="99"/>
@@ -8468,7 +8404,7 @@
     </w:rPr>
   </w:style>
   <w:style w:type="paragraph" w:styleId="EndnoteText">
-    <w:name w:val="endnote text"/>
+    <w:name w:val="Endnote Text"/>
     <w:basedOn w:val="Normal"/>
     <w:link w:val="EndnoteTextChar"/>
     <w:uiPriority w:val="99"/>
@@ -8490,19 +8426,19 @@
     <w:rPr/>
   </w:style>
   <w:style w:type="paragraph" w:styleId="Header">
-    <w:name w:val="header"/>
+    <w:name w:val="Header"/>
     <w:basedOn w:val="HeaderandFooter"/>
     <w:pPr/>
     <w:rPr/>
   </w:style>
   <w:style w:type="paragraph" w:styleId="Footer">
-    <w:name w:val="footer"/>
+    <w:name w:val="Footer"/>
     <w:basedOn w:val="HeaderandFooter"/>
     <w:pPr/>
     <w:rPr/>
   </w:style>
   <w:style w:type="paragraph" w:styleId="TOC1">
-    <w:name w:val="toc 1"/>
+    <w:name w:val="TOC 1"/>
     <w:basedOn w:val="Index"/>
     <w:pPr>
       <w:tabs>
@@ -8514,7 +8450,7 @@
     <w:rPr/>
   </w:style>
   <w:style w:type="paragraph" w:styleId="TOC3">
-    <w:name w:val="toc 3"/>
+    <w:name w:val="TOC 3"/>
     <w:basedOn w:val="Index"/>
     <w:pPr>
       <w:tabs>
@@ -8526,7 +8462,7 @@
     <w:rPr/>
   </w:style>
   <w:style w:type="paragraph" w:styleId="TOC2">
-    <w:name w:val="toc 2"/>
+    <w:name w:val="TOC 2"/>
     <w:basedOn w:val="Index"/>
     <w:pPr>
       <w:tabs>

</xml_diff>